<commit_message>
Edited the figures in report
</commit_message>
<xml_diff>
--- a/Multimodal_AI_Research_Assistant_Report.docx
+++ b/Multimodal_AI_Research_Assistant_Report.docx
@@ -5689,7 +5689,7 @@
       <w:r>
         <w:drawing>
           <wp:inline xmlns:a="http://schemas.openxmlformats.org/drawingml/2006/main" xmlns:pic="http://schemas.openxmlformats.org/drawingml/2006/picture">
-            <wp:extent cx="5029200" cy="2957128"/>
+            <wp:extent cx="5029200" cy="3042693"/>
             <wp:docPr id="3" name="Picture 3"/>
             <wp:cNvGraphicFramePr>
               <a:graphicFrameLocks noChangeAspect="1"/>
@@ -5710,7 +5710,7 @@
                   <pic:spPr>
                     <a:xfrm>
                       <a:off x="0" y="0"/>
-                      <a:ext cx="5029200" cy="2957128"/>
+                      <a:ext cx="5029200" cy="3042693"/>
                     </a:xfrm>
                     <a:prstGeom prst="rect"/>
                   </pic:spPr>
@@ -5834,7 +5834,7 @@
       <w:r>
         <w:drawing>
           <wp:inline xmlns:a="http://schemas.openxmlformats.org/drawingml/2006/main" xmlns:pic="http://schemas.openxmlformats.org/drawingml/2006/picture">
-            <wp:extent cx="5029200" cy="5295086"/>
+            <wp:extent cx="2286000" cy="7844945"/>
             <wp:docPr id="4" name="Picture 4"/>
             <wp:cNvGraphicFramePr>
               <a:graphicFrameLocks noChangeAspect="1"/>
@@ -5855,7 +5855,7 @@
                   <pic:spPr>
                     <a:xfrm>
                       <a:off x="0" y="0"/>
-                      <a:ext cx="5029200" cy="5295086"/>
+                      <a:ext cx="2286000" cy="7844945"/>
                     </a:xfrm>
                     <a:prstGeom prst="rect"/>
                   </pic:spPr>
@@ -10778,7 +10778,7 @@
       <w:r>
         <w:drawing>
           <wp:inline xmlns:a="http://schemas.openxmlformats.org/drawingml/2006/main" xmlns:pic="http://schemas.openxmlformats.org/drawingml/2006/picture">
-            <wp:extent cx="5029200" cy="2801671"/>
+            <wp:extent cx="5029200" cy="4244296"/>
             <wp:docPr id="5" name="Picture 5"/>
             <wp:cNvGraphicFramePr>
               <a:graphicFrameLocks noChangeAspect="1"/>
@@ -10799,7 +10799,7 @@
                   <pic:spPr>
                     <a:xfrm>
                       <a:off x="0" y="0"/>
-                      <a:ext cx="5029200" cy="2801671"/>
+                      <a:ext cx="5029200" cy="4244296"/>
                     </a:xfrm>
                     <a:prstGeom prst="rect"/>
                   </pic:spPr>
@@ -12779,7 +12779,7 @@
       <w:r>
         <w:drawing>
           <wp:inline xmlns:a="http://schemas.openxmlformats.org/drawingml/2006/main" xmlns:pic="http://schemas.openxmlformats.org/drawingml/2006/picture">
-            <wp:extent cx="3180283" cy="5303122"/>
+            <wp:extent cx="2286000" cy="6803335"/>
             <wp:docPr id="9" name="Picture 9"/>
             <wp:cNvGraphicFramePr>
               <a:graphicFrameLocks noChangeAspect="1"/>
@@ -12800,7 +12800,7 @@
                   <pic:spPr>
                     <a:xfrm>
                       <a:off x="0" y="0"/>
-                      <a:ext cx="3180283" cy="5303122"/>
+                      <a:ext cx="2286000" cy="6803335"/>
                     </a:xfrm>
                     <a:prstGeom prst="rect"/>
                   </pic:spPr>
@@ -13586,7 +13586,7 @@
       <w:r>
         <w:drawing>
           <wp:inline xmlns:a="http://schemas.openxmlformats.org/drawingml/2006/main" xmlns:pic="http://schemas.openxmlformats.org/drawingml/2006/picture">
-            <wp:extent cx="3446373" cy="5303106"/>
+            <wp:extent cx="2596896" cy="5304298"/>
             <wp:docPr id="12" name="Picture 12"/>
             <wp:cNvGraphicFramePr>
               <a:graphicFrameLocks noChangeAspect="1"/>
@@ -13607,7 +13607,7 @@
                   <pic:spPr>
                     <a:xfrm>
                       <a:off x="0" y="0"/>
-                      <a:ext cx="3446373" cy="5303106"/>
+                      <a:ext cx="2596896" cy="5304298"/>
                     </a:xfrm>
                     <a:prstGeom prst="rect"/>
                   </pic:spPr>
@@ -15435,7 +15435,7 @@
       <w:r>
         <w:drawing>
           <wp:inline xmlns:a="http://schemas.openxmlformats.org/drawingml/2006/main" xmlns:pic="http://schemas.openxmlformats.org/drawingml/2006/picture">
-            <wp:extent cx="3307384" cy="5304217"/>
+            <wp:extent cx="5029200" cy="639551"/>
             <wp:docPr id="15" name="Picture 15"/>
             <wp:cNvGraphicFramePr>
               <a:graphicFrameLocks noChangeAspect="1"/>
@@ -15456,7 +15456,7 @@
                   <pic:spPr>
                     <a:xfrm>
                       <a:off x="0" y="0"/>
-                      <a:ext cx="3307384" cy="5304217"/>
+                      <a:ext cx="5029200" cy="639551"/>
                     </a:xfrm>
                     <a:prstGeom prst="rect"/>
                   </pic:spPr>
@@ -15830,7 +15830,7 @@
       <w:r>
         <w:drawing>
           <wp:inline xmlns:a="http://schemas.openxmlformats.org/drawingml/2006/main" xmlns:pic="http://schemas.openxmlformats.org/drawingml/2006/picture">
-            <wp:extent cx="5029200" cy="5299520"/>
+            <wp:extent cx="3738981" cy="5303121"/>
             <wp:docPr id="17" name="Picture 17"/>
             <wp:cNvGraphicFramePr>
               <a:graphicFrameLocks noChangeAspect="1"/>
@@ -15851,7 +15851,7 @@
                   <pic:spPr>
                     <a:xfrm>
                       <a:off x="0" y="0"/>
-                      <a:ext cx="5029200" cy="5299520"/>
+                      <a:ext cx="3738981" cy="5303121"/>
                     </a:xfrm>
                     <a:prstGeom prst="rect"/>
                   </pic:spPr>

</xml_diff>

<commit_message>
Changed starting 3 pages of report
</commit_message>
<xml_diff>
--- a/Multimodal_AI_Research_Assistant_Report.docx
+++ b/Multimodal_AI_Research_Assistant_Report.docx
@@ -44,7 +44,7 @@
         <w:rPr>
           <w:rFonts w:ascii="Times New Roman" w:hAnsi="Times New Roman"/>
           <w:b w:val="0"/>
-          <w:i w:val="0"/>
+          <w:i/>
           <w:sz w:val="24"/>
         </w:rPr>
         <w:t>Submitted by</w:t>
@@ -137,8 +137,8 @@
       <w:r>
         <w:rPr>
           <w:rFonts w:ascii="Times New Roman" w:hAnsi="Times New Roman"/>
-          <w:b w:val="0"/>
-          <w:i w:val="0"/>
+          <w:b/>
+          <w:i/>
           <w:sz w:val="24"/>
         </w:rPr>
         <w:t>in partial fulfillment for the award of the degree of</w:t>
@@ -186,14 +186,67 @@
           <w:i w:val="0"/>
           <w:sz w:val="28"/>
         </w:rPr>
-        <w:t>ARTIFICIAL INTELLIGENCE AND DATA SCIENCE</w:t>
+        <w:t>COMPUTER SCIENCE AND ENGINEERING</w:t>
       </w:r>
     </w:p>
-    <w:p/>
-    <w:p/>
     <w:p>
       <w:pPr>
         <w:spacing w:before="0" w:after="120" w:line="360" w:lineRule="exact"/>
+        <w:jc w:val="center"/>
+      </w:pPr>
+      <w:r>
+        <w:rPr>
+          <w:rFonts w:ascii="Times New Roman" w:hAnsi="Times New Roman"/>
+          <w:b/>
+          <w:i w:val="0"/>
+          <w:sz w:val="28"/>
+        </w:rPr>
+        <w:t>(ARTIFICIAL INTELLIGENCE)</w:t>
+      </w:r>
+    </w:p>
+    <w:p>
+      <w:pPr>
+        <w:spacing w:before="360" w:after="360"/>
+        <w:jc w:val="center"/>
+      </w:pPr>
+      <w:r>
+        <w:drawing>
+          <wp:inline xmlns:a="http://schemas.openxmlformats.org/drawingml/2006/main" xmlns:pic="http://schemas.openxmlformats.org/drawingml/2006/picture">
+            <wp:extent cx="2286000" cy="636165"/>
+            <wp:docPr id="1" name="Picture 1"/>
+            <wp:cNvGraphicFramePr>
+              <a:graphicFrameLocks noChangeAspect="1"/>
+            </wp:cNvGraphicFramePr>
+            <a:graphic>
+              <a:graphicData uri="http://schemas.openxmlformats.org/drawingml/2006/picture">
+                <pic:pic>
+                  <pic:nvPicPr>
+                    <pic:cNvPr id="0" name="amrita_logo.png"/>
+                    <pic:cNvPicPr/>
+                  </pic:nvPicPr>
+                  <pic:blipFill>
+                    <a:blip r:embed="rId9"/>
+                    <a:stretch>
+                      <a:fillRect/>
+                    </a:stretch>
+                  </pic:blipFill>
+                  <pic:spPr>
+                    <a:xfrm>
+                      <a:off x="0" y="0"/>
+                      <a:ext cx="2286000" cy="636165"/>
+                    </a:xfrm>
+                    <a:prstGeom prst="rect"/>
+                  </pic:spPr>
+                </pic:pic>
+              </a:graphicData>
+            </a:graphic>
+          </wp:inline>
+        </w:drawing>
+      </w:r>
+    </w:p>
+    <w:p>
+      <w:pPr>
+        <w:spacing w:before="0" w:after="40" w:line="360" w:lineRule="exact"/>
         <w:jc w:val="center"/>
       </w:pPr>
       <w:r>
@@ -208,7 +261,7 @@
     </w:p>
     <w:p>
       <w:pPr>
-        <w:spacing w:before="0" w:after="120" w:line="360" w:lineRule="exact"/>
+        <w:spacing w:before="0" w:after="40" w:line="360" w:lineRule="exact"/>
         <w:jc w:val="center"/>
       </w:pPr>
       <w:r>
@@ -223,28 +276,28 @@
     </w:p>
     <w:p>
       <w:pPr>
-        <w:spacing w:before="0" w:after="120" w:line="360" w:lineRule="exact"/>
+        <w:spacing w:before="0" w:after="40" w:line="360" w:lineRule="exact"/>
         <w:jc w:val="center"/>
       </w:pPr>
       <w:r>
         <w:rPr>
           <w:rFonts w:ascii="Times New Roman" w:hAnsi="Times New Roman"/>
-          <w:b w:val="0"/>
+          <w:b/>
           <w:i w:val="0"/>
-          <w:sz w:val="24"/>
+          <w:sz w:val="26"/>
         </w:rPr>
         <w:t>BENGALURU 560 035</w:t>
       </w:r>
     </w:p>
     <w:p>
       <w:pPr>
-        <w:spacing w:before="0" w:after="120" w:line="360" w:lineRule="exact"/>
+        <w:spacing w:before="80" w:after="120" w:line="360" w:lineRule="exact"/>
         <w:jc w:val="center"/>
       </w:pPr>
       <w:r>
         <w:rPr>
           <w:rFonts w:ascii="Times New Roman" w:hAnsi="Times New Roman"/>
-          <w:b/>
+          <w:b w:val="0"/>
           <w:i w:val="0"/>
           <w:sz w:val="24"/>
         </w:rPr>
@@ -258,7 +311,7 @@
     </w:p>
     <w:p>
       <w:pPr>
-        <w:spacing w:before="240" w:after="120"/>
+        <w:spacing w:before="240" w:after="40"/>
         <w:jc w:val="center"/>
       </w:pPr>
       <w:r>
@@ -266,22 +319,69 @@
           <w:rFonts w:ascii="Times New Roman" w:hAnsi="Times New Roman"/>
           <w:b/>
           <w:i w:val="0"/>
-          <w:sz w:val="32"/>
+          <w:sz w:val="28"/>
         </w:rPr>
         <w:t>AMRITA VISHWA VIDYAPEETHAM</w:t>
-        <w:br/>
+      </w:r>
+    </w:p>
+    <w:p>
+      <w:pPr>
+        <w:spacing w:before="40" w:after="160"/>
+        <w:jc w:val="center"/>
+      </w:pPr>
+      <w:r>
+        <w:rPr>
+          <w:rFonts w:ascii="Times New Roman" w:hAnsi="Times New Roman"/>
+          <w:b/>
+          <w:i w:val="0"/>
+          <w:sz w:val="28"/>
+        </w:rPr>
         <w:t>AMRITA SCHOOL OF COMPUTING, BENGALURU, 560035</w:t>
       </w:r>
     </w:p>
     <w:p>
       <w:pPr>
-        <w:spacing w:before="0" w:after="240" w:line="360" w:lineRule="exact"/>
-        <w:jc w:val="both"/>
-      </w:pPr>
+        <w:spacing w:before="120" w:after="280"/>
+        <w:jc w:val="center"/>
+      </w:pPr>
+      <w:r>
+        <w:drawing>
+          <wp:inline xmlns:a="http://schemas.openxmlformats.org/drawingml/2006/main" xmlns:pic="http://schemas.openxmlformats.org/drawingml/2006/picture">
+            <wp:extent cx="1828800" cy="508932"/>
+            <wp:docPr id="2" name="Picture 2"/>
+            <wp:cNvGraphicFramePr>
+              <a:graphicFrameLocks noChangeAspect="1"/>
+            </wp:cNvGraphicFramePr>
+            <a:graphic>
+              <a:graphicData uri="http://schemas.openxmlformats.org/drawingml/2006/picture">
+                <pic:pic>
+                  <pic:nvPicPr>
+                    <pic:cNvPr id="0" name="amrita_logo.png"/>
+                    <pic:cNvPicPr/>
+                  </pic:nvPicPr>
+                  <pic:blipFill>
+                    <a:blip r:embed="rId9"/>
+                    <a:stretch>
+                      <a:fillRect/>
+                    </a:stretch>
+                  </pic:blipFill>
+                  <pic:spPr>
+                    <a:xfrm>
+                      <a:off x="0" y="0"/>
+                      <a:ext cx="1828800" cy="508932"/>
+                    </a:xfrm>
+                    <a:prstGeom prst="rect"/>
+                  </pic:spPr>
+                </pic:pic>
+              </a:graphicData>
+            </a:graphic>
+          </wp:inline>
+        </w:drawing>
+      </w:r>
     </w:p>
     <w:p>
       <w:pPr>
-        <w:spacing w:before="240" w:after="120"/>
+        <w:spacing w:before="200" w:after="280"/>
         <w:jc w:val="center"/>
       </w:pPr>
       <w:r>
@@ -296,7 +396,7 @@
     </w:p>
     <w:p>
       <w:pPr>
-        <w:spacing w:before="0" w:after="120" w:line="360" w:lineRule="exact"/>
+        <w:spacing w:before="120" w:after="120"/>
         <w:jc w:val="both"/>
       </w:pPr>
       <w:r>
@@ -306,7 +406,26 @@
           <w:i w:val="0"/>
           <w:sz w:val="24"/>
         </w:rPr>
-        <w:t>This is to certify that the project report entitled "A Modular Multimodal Retrieval-Augmented Agentic Framework for Intelligent Scientific Document Understanding" submitted by</w:t>
+        <w:t xml:space="preserve">This is to certify that the project report entitled </w:t>
+      </w:r>
+      <w:r>
+        <w:rPr>
+          <w:rFonts w:ascii="Times New Roman" w:hAnsi="Times New Roman"/>
+          <w:b/>
+          <w:i w:val="0"/>
+          <w:color w:val="B40000"/>
+          <w:sz w:val="24"/>
+        </w:rPr>
+        <w:t>"A Modular Multimodal Retrieval-Augmented Agentic Framework for Intelligent Scientific Document Understanding"</w:t>
+      </w:r>
+      <w:r>
+        <w:rPr>
+          <w:rFonts w:ascii="Times New Roman" w:hAnsi="Times New Roman"/>
+          <w:b w:val="0"/>
+          <w:i w:val="0"/>
+          <w:sz w:val="24"/>
+        </w:rPr>
+        <w:t xml:space="preserve"> submitted by</w:t>
       </w:r>
     </w:p>
     <w:p>
@@ -381,7 +500,7 @@
     </w:p>
     <w:p>
       <w:pPr>
-        <w:spacing w:before="0" w:after="120" w:line="360" w:lineRule="exact"/>
+        <w:spacing w:before="200" w:after="120"/>
         <w:jc w:val="both"/>
       </w:pPr>
       <w:r>
@@ -391,111 +510,17 @@
           <w:i w:val="0"/>
           <w:sz w:val="24"/>
         </w:rPr>
-        <w:t>in partial fulfillment of the requirements as part of Bachelor of Technology in "ARTIFICIAL INTELLIGENCE AND DATA SCIENCE" is a bonafide record of the work carried out under our guidance and supervision at Amrita School of Computing, Bengaluru.</w:t>
+        <w:t xml:space="preserve">in partial fulfillment of the requirements as part of </w:t>
       </w:r>
-    </w:p>
-    <w:p>
-      <w:pPr>
-        <w:spacing w:before="0" w:after="480" w:line="360" w:lineRule="exact"/>
-        <w:jc w:val="both"/>
-      </w:pPr>
-    </w:p>
-    <w:tbl>
-      <w:tblPr>
-        <w:tblStyle w:val="TableGrid"/>
-        <w:tblW w:type="auto" w:w="0"/>
-        <w:tblLook w:firstColumn="1" w:firstRow="1" w:lastColumn="0" w:lastRow="0" w:noHBand="0" w:noVBand="1" w:val="04A0"/>
-      </w:tblPr>
-      <w:tblGrid>
-        <w:gridCol w:w="4500"/>
-        <w:gridCol w:w="4500"/>
-      </w:tblGrid>
-      <w:tr>
-        <w:tc>
-          <w:tcPr>
-            <w:tcW w:type="dxa" w:w="4500"/>
-          </w:tcPr>
-          <w:p>
-            <w:r>
-              <w:rPr>
-                <w:rFonts w:ascii="Times New Roman" w:hAnsi="Times New Roman"/>
-                <w:b w:val="0"/>
-                <w:i w:val="0"/>
-                <w:sz w:val="22"/>
-              </w:rPr>
-              <w:t>____________________</w:t>
-            </w:r>
-          </w:p>
-        </w:tc>
-        <w:tc>
-          <w:tcPr>
-            <w:tcW w:type="dxa" w:w="4500"/>
-          </w:tcPr>
-          <w:p>
-            <w:r>
-              <w:rPr>
-                <w:rFonts w:ascii="Times New Roman" w:hAnsi="Times New Roman"/>
-                <w:b w:val="0"/>
-                <w:i w:val="0"/>
-                <w:sz w:val="22"/>
-              </w:rPr>
-              <w:t>____________________</w:t>
-            </w:r>
-          </w:p>
-        </w:tc>
-      </w:tr>
-      <w:tr>
-        <w:tc>
-          <w:tcPr>
-            <w:tcW w:type="dxa" w:w="4500"/>
-          </w:tcPr>
-          <w:p>
-            <w:r>
-              <w:rPr>
-                <w:rFonts w:ascii="Times New Roman" w:hAnsi="Times New Roman"/>
-                <w:b w:val="0"/>
-                <w:i w:val="0"/>
-                <w:sz w:val="22"/>
-              </w:rPr>
-              <w:t>Project Guide</w:t>
-              <w:br/>
-              <w:t>Department of CSE</w:t>
-              <w:br/>
-              <w:t>Amrita School of Computing</w:t>
-            </w:r>
-          </w:p>
-        </w:tc>
-        <w:tc>
-          <w:tcPr>
-            <w:tcW w:type="dxa" w:w="4500"/>
-          </w:tcPr>
-          <w:p>
-            <w:r>
-              <w:rPr>
-                <w:rFonts w:ascii="Times New Roman" w:hAnsi="Times New Roman"/>
-                <w:b w:val="0"/>
-                <w:i w:val="0"/>
-                <w:sz w:val="22"/>
-              </w:rPr>
-              <w:t>Chair</w:t>
-              <w:br/>
-              <w:t>School of Computing</w:t>
-            </w:r>
-          </w:p>
-        </w:tc>
-      </w:tr>
-    </w:tbl>
-    <w:p>
-      <w:pPr>
-        <w:spacing w:before="0" w:after="320" w:line="360" w:lineRule="exact"/>
-        <w:jc w:val="both"/>
-      </w:pPr>
-    </w:p>
-    <w:p>
-      <w:pPr>
-        <w:spacing w:before="0" w:after="120" w:line="360" w:lineRule="exact"/>
-        <w:jc w:val="both"/>
-      </w:pPr>
+      <w:r>
+        <w:rPr>
+          <w:rFonts w:ascii="Times New Roman" w:hAnsi="Times New Roman"/>
+          <w:b/>
+          <w:i w:val="0"/>
+          <w:sz w:val="24"/>
+        </w:rPr>
+        <w:t>Bachelor of Technology</w:t>
+      </w:r>
       <w:r>
         <w:rPr>
           <w:rFonts w:ascii="Times New Roman" w:hAnsi="Times New Roman"/>
@@ -503,7 +528,25 @@
           <w:i w:val="0"/>
           <w:sz w:val="24"/>
         </w:rPr>
-        <w:t>This project report was evaluated by us on …………</w:t>
+        <w:t xml:space="preserve"> in </w:t>
+      </w:r>
+      <w:r>
+        <w:rPr>
+          <w:rFonts w:ascii="Times New Roman" w:hAnsi="Times New Roman"/>
+          <w:b/>
+          <w:i w:val="0"/>
+          <w:sz w:val="24"/>
+        </w:rPr>
+        <w:t>"COMPUTER SCIENCE AND ENGINEERING (ARTIFICIAL INTELLIGENCE)"</w:t>
+      </w:r>
+      <w:r>
+        <w:rPr>
+          <w:rFonts w:ascii="Times New Roman" w:hAnsi="Times New Roman"/>
+          <w:b w:val="0"/>
+          <w:i w:val="0"/>
+          <w:sz w:val="24"/>
+        </w:rPr>
+        <w:t xml:space="preserve"> is a bonafide record of the work carried out under my guidance and supervision at Amrita School of Computing, Bengaluru.</w:t>
       </w:r>
     </w:p>
     <w:p>
@@ -517,6 +560,14 @@
         <w:tblStyle w:val="TableGrid"/>
         <w:tblW w:type="auto" w:w="0"/>
         <w:tblLook w:firstColumn="1" w:firstRow="1" w:lastColumn="0" w:lastRow="0" w:noHBand="0" w:noVBand="1" w:val="04A0"/>
+        <w:tblBorders>
+          <w:top w:val="none" w:sz="0" w:space="0" w:color="auto"/>
+          <w:left w:val="none" w:sz="0" w:space="0" w:color="auto"/>
+          <w:bottom w:val="none" w:sz="0" w:space="0" w:color="auto"/>
+          <w:right w:val="none" w:sz="0" w:space="0" w:color="auto"/>
+          <w:insideH w:val="none" w:sz="0" w:space="0" w:color="auto"/>
+          <w:insideV w:val="none" w:sz="0" w:space="0" w:color="auto"/>
+        </w:tblBorders>
       </w:tblPr>
       <w:tblGrid>
         <w:gridCol w:w="4500"/>
@@ -529,6 +580,12 @@
           </w:tcPr>
           <w:p>
             <w:r>
+              <w:rPr>
+                <w:rFonts w:ascii="Times New Roman" w:hAnsi="Times New Roman"/>
+                <w:b w:val="0"/>
+                <w:i w:val="0"/>
+                <w:sz w:val="24"/>
+              </w:rPr>
               <w:t>____________________</w:t>
             </w:r>
           </w:p>
@@ -539,6 +596,12 @@
           </w:tcPr>
           <w:p>
             <w:r>
+              <w:rPr>
+                <w:rFonts w:ascii="Times New Roman" w:hAnsi="Times New Roman"/>
+                <w:b w:val="0"/>
+                <w:i w:val="0"/>
+                <w:sz w:val="24"/>
+              </w:rPr>
               <w:t>____________________</w:t>
             </w:r>
           </w:p>
@@ -551,6 +614,206 @@
           </w:tcPr>
           <w:p>
             <w:r>
+              <w:rPr>
+                <w:rFonts w:ascii="Times New Roman" w:hAnsi="Times New Roman"/>
+                <w:b w:val="0"/>
+                <w:i w:val="0"/>
+                <w:color w:val="B40000"/>
+                <w:sz w:val="24"/>
+              </w:rPr>
+              <w:t>Vishwas H.N</w:t>
+            </w:r>
+          </w:p>
+        </w:tc>
+        <w:tc>
+          <w:tcPr>
+            <w:tcW w:type="dxa" w:w="4500"/>
+          </w:tcPr>
+          <w:p>
+            <w:r>
+              <w:rPr>
+                <w:rFonts w:ascii="Times New Roman" w:hAnsi="Times New Roman"/>
+                <w:b w:val="0"/>
+                <w:i w:val="0"/>
+                <w:color w:val="B40000"/>
+                <w:sz w:val="24"/>
+              </w:rPr>
+              <w:t>Chair Name</w:t>
+            </w:r>
+          </w:p>
+        </w:tc>
+      </w:tr>
+      <w:tr>
+        <w:tc>
+          <w:tcPr>
+            <w:tcW w:type="dxa" w:w="4500"/>
+          </w:tcPr>
+          <w:p>
+            <w:r>
+              <w:rPr>
+                <w:rFonts w:ascii="Times New Roman" w:hAnsi="Times New Roman"/>
+                <w:b w:val="0"/>
+                <w:i w:val="0"/>
+                <w:color w:val="B40000"/>
+                <w:sz w:val="24"/>
+              </w:rPr>
+              <w:t>Assistant Professor(Sr. Gd.)</w:t>
+            </w:r>
+          </w:p>
+        </w:tc>
+        <w:tc>
+          <w:tcPr>
+            <w:tcW w:type="dxa" w:w="4500"/>
+          </w:tcPr>
+          <w:p>
+            <w:r>
+              <w:rPr>
+                <w:rFonts w:ascii="Times New Roman" w:hAnsi="Times New Roman"/>
+                <w:b w:val="0"/>
+                <w:i w:val="0"/>
+                <w:sz w:val="24"/>
+              </w:rPr>
+              <w:t>Chair</w:t>
+            </w:r>
+          </w:p>
+        </w:tc>
+      </w:tr>
+      <w:tr>
+        <w:tc>
+          <w:tcPr>
+            <w:tcW w:type="dxa" w:w="4500"/>
+          </w:tcPr>
+          <w:p>
+            <w:r>
+              <w:rPr>
+                <w:rFonts w:ascii="Times New Roman" w:hAnsi="Times New Roman"/>
+                <w:b w:val="0"/>
+                <w:i w:val="0"/>
+                <w:sz w:val="24"/>
+              </w:rPr>
+              <w:t>Guide</w:t>
+            </w:r>
+          </w:p>
+        </w:tc>
+        <w:tc>
+          <w:tcPr>
+            <w:tcW w:type="dxa" w:w="4500"/>
+          </w:tcPr>
+          <w:p>
+            <w:r>
+              <w:rPr>
+                <w:rFonts w:ascii="Times New Roman" w:hAnsi="Times New Roman"/>
+                <w:b w:val="0"/>
+                <w:i w:val="0"/>
+                <w:sz w:val="24"/>
+              </w:rPr>
+              <w:t>School of Computing</w:t>
+            </w:r>
+          </w:p>
+        </w:tc>
+      </w:tr>
+    </w:tbl>
+    <w:p>
+      <w:pPr>
+        <w:spacing w:before="0" w:after="320" w:line="360" w:lineRule="exact"/>
+        <w:jc w:val="both"/>
+      </w:pPr>
+    </w:p>
+    <w:p>
+      <w:pPr>
+        <w:spacing w:before="120"/>
+        <w:jc w:val="left"/>
+      </w:pPr>
+      <w:r>
+        <w:rPr>
+          <w:rFonts w:ascii="Times New Roman" w:hAnsi="Times New Roman"/>
+          <w:b w:val="0"/>
+          <w:i w:val="0"/>
+          <w:sz w:val="24"/>
+        </w:rPr>
+        <w:t xml:space="preserve">This project report was evaluated by us on </w:t>
+      </w:r>
+      <w:r>
+        <w:rPr>
+          <w:rFonts w:ascii="Times New Roman" w:hAnsi="Times New Roman"/>
+          <w:b w:val="0"/>
+          <w:i w:val="0"/>
+          <w:sz w:val="24"/>
+        </w:rPr>
+        <w:t>_____________</w:t>
+      </w:r>
+    </w:p>
+    <w:p>
+      <w:pPr>
+        <w:spacing w:before="0" w:after="480" w:line="360" w:lineRule="exact"/>
+        <w:jc w:val="both"/>
+      </w:pPr>
+    </w:p>
+    <w:tbl>
+      <w:tblPr>
+        <w:tblStyle w:val="TableGrid"/>
+        <w:tblW w:type="auto" w:w="0"/>
+        <w:tblLook w:firstColumn="1" w:firstRow="1" w:lastColumn="0" w:lastRow="0" w:noHBand="0" w:noVBand="1" w:val="04A0"/>
+        <w:tblBorders>
+          <w:top w:val="none" w:sz="0" w:space="0" w:color="auto"/>
+          <w:left w:val="none" w:sz="0" w:space="0" w:color="auto"/>
+          <w:bottom w:val="none" w:sz="0" w:space="0" w:color="auto"/>
+          <w:right w:val="none" w:sz="0" w:space="0" w:color="auto"/>
+          <w:insideH w:val="none" w:sz="0" w:space="0" w:color="auto"/>
+          <w:insideV w:val="none" w:sz="0" w:space="0" w:color="auto"/>
+        </w:tblBorders>
+      </w:tblPr>
+      <w:tblGrid>
+        <w:gridCol w:w="4500"/>
+        <w:gridCol w:w="4500"/>
+      </w:tblGrid>
+      <w:tr>
+        <w:tc>
+          <w:tcPr>
+            <w:tcW w:type="dxa" w:w="4500"/>
+          </w:tcPr>
+          <w:p>
+            <w:r>
+              <w:rPr>
+                <w:rFonts w:ascii="Times New Roman" w:hAnsi="Times New Roman"/>
+                <w:b w:val="0"/>
+                <w:i w:val="0"/>
+                <w:sz w:val="24"/>
+              </w:rPr>
+              <w:t>____________________</w:t>
+            </w:r>
+          </w:p>
+        </w:tc>
+        <w:tc>
+          <w:tcPr>
+            <w:tcW w:type="dxa" w:w="4500"/>
+          </w:tcPr>
+          <w:p>
+            <w:r>
+              <w:rPr>
+                <w:rFonts w:ascii="Times New Roman" w:hAnsi="Times New Roman"/>
+                <w:b w:val="0"/>
+                <w:i w:val="0"/>
+                <w:sz w:val="24"/>
+              </w:rPr>
+              <w:t>____________________</w:t>
+            </w:r>
+          </w:p>
+        </w:tc>
+      </w:tr>
+      <w:tr>
+        <w:tc>
+          <w:tcPr>
+            <w:tcW w:type="dxa" w:w="4500"/>
+          </w:tcPr>
+          <w:p>
+            <w:r>
+              <w:rPr>
+                <w:rFonts w:ascii="Times New Roman" w:hAnsi="Times New Roman"/>
+                <w:b w:val="0"/>
+                <w:i w:val="0"/>
+                <w:sz w:val="24"/>
+              </w:rPr>
               <w:t>Examiner 1</w:t>
             </w:r>
           </w:p>
@@ -561,6 +824,12 @@
           </w:tcPr>
           <w:p>
             <w:r>
+              <w:rPr>
+                <w:rFonts w:ascii="Times New Roman" w:hAnsi="Times New Roman"/>
+                <w:b w:val="0"/>
+                <w:i w:val="0"/>
+                <w:sz w:val="24"/>
+              </w:rPr>
               <w:t>Examiner 2</w:t>
             </w:r>
           </w:p>
@@ -589,7 +858,7 @@
     </w:p>
     <w:p>
       <w:pPr>
-        <w:spacing w:before="0" w:after="120" w:line="360" w:lineRule="exact"/>
+        <w:spacing w:before="120" w:after="120" w:line="360" w:lineRule="exact"/>
         <w:jc w:val="both"/>
       </w:pPr>
       <w:r>
@@ -599,12 +868,13 @@
           <w:i w:val="0"/>
           <w:sz w:val="24"/>
         </w:rPr>
-        <w:t>The satisfaction that accompanies the successful completion of any task would be incomplete without mentioning the people who made it possible, whose constant encouragement and guidance have been an endless source of inspiration throughout the course of this project work.</w:t>
+        <w:t>The satisfaction that accompanies successful completion of any task would be incomplete without mention of people who made it possible, and whose constant encouragement and guidance have been source of inspiration throughout the course of this project work.</w:t>
       </w:r>
     </w:p>
     <w:p>
       <w:pPr>
-        <w:spacing w:before="0" w:after="120" w:line="360" w:lineRule="exact"/>
+        <w:spacing w:before="120" w:after="120" w:line="360" w:lineRule="exact"/>
+        <w:ind w:firstLine="432"/>
         <w:jc w:val="both"/>
       </w:pPr>
       <w:r>
@@ -614,14 +884,17 @@
           <w:i w:val="0"/>
           <w:sz w:val="24"/>
         </w:rPr>
-        <w:t>We offer our sincere pranams at the lotus feet of 'AMMA', Mata Amritanandamayi Devi, who showered her blessings upon us throughout the course of this project work.</w:t>
+        <w:t xml:space="preserve">We offer our sincere pranams at the lotus feet of </w:t>
       </w:r>
-    </w:p>
-    <w:p>
-      <w:pPr>
-        <w:spacing w:before="0" w:after="120" w:line="360" w:lineRule="exact"/>
-        <w:jc w:val="both"/>
-      </w:pPr>
+      <w:r>
+        <w:rPr>
+          <w:rFonts w:ascii="Times New Roman" w:hAnsi="Times New Roman"/>
+          <w:b/>
+          <w:i w:val="0"/>
+          <w:sz w:val="24"/>
+        </w:rPr>
+        <w:t>“AMMA”, MATA AMRITANANDAMAYI DEVI</w:t>
+      </w:r>
       <w:r>
         <w:rPr>
           <w:rFonts w:ascii="Times New Roman" w:hAnsi="Times New Roman"/>
@@ -629,12 +902,13 @@
           <w:i w:val="0"/>
           <w:sz w:val="24"/>
         </w:rPr>
-        <w:t>We owe our gratitude to Prof. Manoj P., Director, Amrita Vishwa Vidyapeetham, Bengaluru Campus. We would like to place our heartfelt gratitude to Dr. Gopalakrishnan E.A., Principal, Amrita School of Computing and Amrita School of Artificial Intelligence, Bengaluru, for his valuable support and inspiration.</w:t>
+        <w:t xml:space="preserve"> who showered her blessing upon us throughout the course of this project work.</w:t>
       </w:r>
     </w:p>
     <w:p>
       <w:pPr>
-        <w:spacing w:before="0" w:after="120" w:line="360" w:lineRule="exact"/>
+        <w:spacing w:before="120" w:after="120" w:line="360" w:lineRule="exact"/>
+        <w:ind w:firstLine="432"/>
         <w:jc w:val="both"/>
       </w:pPr>
       <w:r>
@@ -644,14 +918,17 @@
           <w:i w:val="0"/>
           <w:sz w:val="24"/>
         </w:rPr>
-        <w:t>It is a great pleasure to express our gratitude and indebtedness to our project guide, Department of Computer Science and Engineering, Amrita School of Computing, Bengaluru, for their invaluable guidance, encouragement, moral support, and affection throughout the project work.</w:t>
+        <w:t xml:space="preserve">We owe our gratitude to </w:t>
       </w:r>
-    </w:p>
-    <w:p>
-      <w:pPr>
-        <w:spacing w:before="0" w:after="120" w:line="360" w:lineRule="exact"/>
-        <w:jc w:val="both"/>
-      </w:pPr>
+      <w:r>
+        <w:rPr>
+          <w:rFonts w:ascii="Times New Roman" w:hAnsi="Times New Roman"/>
+          <w:b/>
+          <w:i w:val="0"/>
+          <w:sz w:val="24"/>
+        </w:rPr>
+        <w:t>Prof. Manoj P.</w:t>
+      </w:r>
       <w:r>
         <w:rPr>
           <w:rFonts w:ascii="Times New Roman" w:hAnsi="Times New Roman"/>
@@ -659,19 +936,17 @@
           <w:i w:val="0"/>
           <w:sz w:val="24"/>
         </w:rPr>
-        <w:t>We would like to express our gratitude to the project panel members for their suggestions, encouragement, and moral support during the process of project work, and all faculty members for their academic support. Finally, we are forever grateful to our parents, who have loved, supported, and encouraged us in all our endeavours.</w:t>
+        <w:t xml:space="preserve">, Director, Amrita Vishwa Vidyapeetham Bengaluru Campus.  We would like to place our heartfelt gratitude to </w:t>
       </w:r>
-    </w:p>
-    <w:p>
-      <w:pPr>
-        <w:spacing w:before="0" w:after="480" w:line="360" w:lineRule="exact"/>
-        <w:jc w:val="both"/>
-      </w:pPr>
-    </w:p>
-    <w:p>
-      <w:pPr>
-        <w:jc w:val="right"/>
-      </w:pPr>
+      <w:r>
+        <w:rPr>
+          <w:rFonts w:ascii="Times New Roman" w:hAnsi="Times New Roman"/>
+          <w:b/>
+          <w:i w:val="0"/>
+          <w:sz w:val="24"/>
+        </w:rPr>
+        <w:t>Dr. Gopalakrishnan E.A.</w:t>
+      </w:r>
       <w:r>
         <w:rPr>
           <w:rFonts w:ascii="Times New Roman" w:hAnsi="Times New Roman"/>
@@ -679,13 +954,58 @@
           <w:i w:val="0"/>
           <w:sz w:val="24"/>
         </w:rPr>
-        <w:t>Dorai Sai Charan</w:t>
-        <w:br/>
-        <w:t>K. Nithin</w:t>
-        <w:br/>
-        <w:t>Vijay</w:t>
-        <w:br/>
-        <w:t>Dinesh</w:t>
+        <w:t>, Principal, Amrita School of Computing and Amrita School of Artificial Intelligence, Bengaluru for his valuable support and inspiration.</w:t>
+      </w:r>
+    </w:p>
+    <w:p>
+      <w:pPr>
+        <w:spacing w:before="120" w:after="120" w:line="360" w:lineRule="exact"/>
+        <w:ind w:firstLine="432"/>
+        <w:jc w:val="both"/>
+      </w:pPr>
+      <w:r>
+        <w:rPr>
+          <w:rFonts w:ascii="Times New Roman" w:hAnsi="Times New Roman"/>
+          <w:b w:val="0"/>
+          <w:i w:val="0"/>
+          <w:sz w:val="24"/>
+        </w:rPr>
+        <w:t xml:space="preserve">It is a great pleasure to express our gratitude and indebtedness to our project guide </w:t>
+      </w:r>
+      <w:r>
+        <w:rPr>
+          <w:rFonts w:ascii="Times New Roman" w:hAnsi="Times New Roman"/>
+          <w:b/>
+          <w:i w:val="0"/>
+          <w:color w:val="B40000"/>
+          <w:sz w:val="24"/>
+        </w:rPr>
+        <w:t>Vishwas H.N, Assistant Professor(Sr. Gd.)</w:t>
+      </w:r>
+      <w:r>
+        <w:rPr>
+          <w:rFonts w:ascii="Times New Roman" w:hAnsi="Times New Roman"/>
+          <w:b w:val="0"/>
+          <w:i w:val="0"/>
+          <w:sz w:val="24"/>
+        </w:rPr>
+        <w:t>, Department of Computer Science and Engineering, Amrita School of Computing, Bengaluru for her/his valuable guidance, encouragement, moral support, and affection throughout the project work.</w:t>
+      </w:r>
+    </w:p>
+    <w:p>
+      <w:pPr>
+        <w:spacing w:before="120" w:after="120" w:line="360" w:lineRule="exact"/>
+        <w:ind w:firstLine="432"/>
+        <w:jc w:val="both"/>
+      </w:pPr>
+      <w:r>
+        <w:rPr>
+          <w:rFonts w:ascii="Times New Roman" w:hAnsi="Times New Roman"/>
+          <w:b w:val="0"/>
+          <w:i w:val="0"/>
+          <w:sz w:val="24"/>
+        </w:rPr>
+        <w:t>We would like to express our gratitude to project panel members for their suggestions, encouragement, and moral support during the process of project work and all faculty members for their academic support.  Finally, we are forever grateful to our parents, who have loved, supported, and encouraged us in all our endeavors.</w:t>
       </w:r>
     </w:p>
     <w:p>
@@ -5059,7 +5379,7 @@
         <w:drawing>
           <wp:inline xmlns:a="http://schemas.openxmlformats.org/drawingml/2006/main" xmlns:pic="http://schemas.openxmlformats.org/drawingml/2006/picture">
             <wp:extent cx="5029200" cy="2616347"/>
-            <wp:docPr id="1" name="Picture 1"/>
+            <wp:docPr id="3" name="Picture 3"/>
             <wp:cNvGraphicFramePr>
               <a:graphicFrameLocks noChangeAspect="1"/>
             </wp:cNvGraphicFramePr>
@@ -5071,7 +5391,7 @@
                     <pic:cNvPicPr/>
                   </pic:nvPicPr>
                   <pic:blipFill>
-                    <a:blip r:embed="rId9"/>
+                    <a:blip r:embed="rId10"/>
                     <a:stretch>
                       <a:fillRect/>
                     </a:stretch>
@@ -5560,7 +5880,7 @@
         <w:drawing>
           <wp:inline xmlns:a="http://schemas.openxmlformats.org/drawingml/2006/main" xmlns:pic="http://schemas.openxmlformats.org/drawingml/2006/picture">
             <wp:extent cx="5029200" cy="5294198"/>
-            <wp:docPr id="2" name="Picture 2"/>
+            <wp:docPr id="4" name="Picture 4"/>
             <wp:cNvGraphicFramePr>
               <a:graphicFrameLocks noChangeAspect="1"/>
             </wp:cNvGraphicFramePr>
@@ -5572,7 +5892,7 @@
                     <pic:cNvPicPr/>
                   </pic:nvPicPr>
                   <pic:blipFill>
-                    <a:blip r:embed="rId10"/>
+                    <a:blip r:embed="rId11"/>
                     <a:stretch>
                       <a:fillRect/>
                     </a:stretch>
@@ -5690,7 +6010,7 @@
         <w:drawing>
           <wp:inline xmlns:a="http://schemas.openxmlformats.org/drawingml/2006/main" xmlns:pic="http://schemas.openxmlformats.org/drawingml/2006/picture">
             <wp:extent cx="5029200" cy="3042693"/>
-            <wp:docPr id="3" name="Picture 3"/>
+            <wp:docPr id="5" name="Picture 5"/>
             <wp:cNvGraphicFramePr>
               <a:graphicFrameLocks noChangeAspect="1"/>
             </wp:cNvGraphicFramePr>
@@ -5702,7 +6022,7 @@
                     <pic:cNvPicPr/>
                   </pic:nvPicPr>
                   <pic:blipFill>
-                    <a:blip r:embed="rId11"/>
+                    <a:blip r:embed="rId12"/>
                     <a:stretch>
                       <a:fillRect/>
                     </a:stretch>
@@ -5835,7 +6155,7 @@
         <w:drawing>
           <wp:inline xmlns:a="http://schemas.openxmlformats.org/drawingml/2006/main" xmlns:pic="http://schemas.openxmlformats.org/drawingml/2006/picture">
             <wp:extent cx="2286000" cy="7844945"/>
-            <wp:docPr id="4" name="Picture 4"/>
+            <wp:docPr id="6" name="Picture 6"/>
             <wp:cNvGraphicFramePr>
               <a:graphicFrameLocks noChangeAspect="1"/>
             </wp:cNvGraphicFramePr>
@@ -5847,7 +6167,7 @@
                     <pic:cNvPicPr/>
                   </pic:nvPicPr>
                   <pic:blipFill>
-                    <a:blip r:embed="rId12"/>
+                    <a:blip r:embed="rId13"/>
                     <a:stretch>
                       <a:fillRect/>
                     </a:stretch>
@@ -10779,7 +11099,7 @@
         <w:drawing>
           <wp:inline xmlns:a="http://schemas.openxmlformats.org/drawingml/2006/main" xmlns:pic="http://schemas.openxmlformats.org/drawingml/2006/picture">
             <wp:extent cx="5029200" cy="4244296"/>
-            <wp:docPr id="5" name="Picture 5"/>
+            <wp:docPr id="7" name="Picture 7"/>
             <wp:cNvGraphicFramePr>
               <a:graphicFrameLocks noChangeAspect="1"/>
             </wp:cNvGraphicFramePr>
@@ -10791,7 +11111,7 @@
                     <pic:cNvPicPr/>
                   </pic:nvPicPr>
                   <pic:blipFill>
-                    <a:blip r:embed="rId13"/>
+                    <a:blip r:embed="rId14"/>
                     <a:stretch>
                       <a:fillRect/>
                     </a:stretch>
@@ -11004,7 +11324,7 @@
         <w:drawing>
           <wp:inline xmlns:a="http://schemas.openxmlformats.org/drawingml/2006/main" xmlns:pic="http://schemas.openxmlformats.org/drawingml/2006/picture">
             <wp:extent cx="4240072" cy="5303612"/>
-            <wp:docPr id="6" name="Picture 6"/>
+            <wp:docPr id="8" name="Picture 8"/>
             <wp:cNvGraphicFramePr>
               <a:graphicFrameLocks noChangeAspect="1"/>
             </wp:cNvGraphicFramePr>
@@ -11016,7 +11336,7 @@
                     <pic:cNvPicPr/>
                   </pic:nvPicPr>
                   <pic:blipFill>
-                    <a:blip r:embed="rId14"/>
+                    <a:blip r:embed="rId15"/>
                     <a:stretch>
                       <a:fillRect/>
                     </a:stretch>
@@ -12595,7 +12915,7 @@
         <w:drawing>
           <wp:inline xmlns:a="http://schemas.openxmlformats.org/drawingml/2006/main" xmlns:pic="http://schemas.openxmlformats.org/drawingml/2006/picture">
             <wp:extent cx="5029200" cy="4298212"/>
-            <wp:docPr id="7" name="Picture 7"/>
+            <wp:docPr id="9" name="Picture 9"/>
             <wp:cNvGraphicFramePr>
               <a:graphicFrameLocks noChangeAspect="1"/>
             </wp:cNvGraphicFramePr>
@@ -12607,7 +12927,7 @@
                     <pic:cNvPicPr/>
                   </pic:nvPicPr>
                   <pic:blipFill>
-                    <a:blip r:embed="rId15"/>
+                    <a:blip r:embed="rId16"/>
                     <a:stretch>
                       <a:fillRect/>
                     </a:stretch>
@@ -12680,7 +13000,7 @@
         <w:drawing>
           <wp:inline xmlns:a="http://schemas.openxmlformats.org/drawingml/2006/main" xmlns:pic="http://schemas.openxmlformats.org/drawingml/2006/picture">
             <wp:extent cx="5029200" cy="5273287"/>
-            <wp:docPr id="8" name="Picture 8"/>
+            <wp:docPr id="10" name="Picture 10"/>
             <wp:cNvGraphicFramePr>
               <a:graphicFrameLocks noChangeAspect="1"/>
             </wp:cNvGraphicFramePr>
@@ -12692,7 +13012,7 @@
                     <pic:cNvPicPr/>
                   </pic:nvPicPr>
                   <pic:blipFill>
-                    <a:blip r:embed="rId16"/>
+                    <a:blip r:embed="rId17"/>
                     <a:stretch>
                       <a:fillRect/>
                     </a:stretch>
@@ -12780,7 +13100,7 @@
         <w:drawing>
           <wp:inline xmlns:a="http://schemas.openxmlformats.org/drawingml/2006/main" xmlns:pic="http://schemas.openxmlformats.org/drawingml/2006/picture">
             <wp:extent cx="2286000" cy="6803335"/>
-            <wp:docPr id="9" name="Picture 9"/>
+            <wp:docPr id="11" name="Picture 11"/>
             <wp:cNvGraphicFramePr>
               <a:graphicFrameLocks noChangeAspect="1"/>
             </wp:cNvGraphicFramePr>
@@ -12792,7 +13112,7 @@
                     <pic:cNvPicPr/>
                   </pic:nvPicPr>
                   <pic:blipFill>
-                    <a:blip r:embed="rId17"/>
+                    <a:blip r:embed="rId18"/>
                     <a:stretch>
                       <a:fillRect/>
                     </a:stretch>
@@ -13020,7 +13340,7 @@
         <w:drawing>
           <wp:inline xmlns:a="http://schemas.openxmlformats.org/drawingml/2006/main" xmlns:pic="http://schemas.openxmlformats.org/drawingml/2006/picture">
             <wp:extent cx="5029200" cy="2646556"/>
-            <wp:docPr id="10" name="Picture 10"/>
+            <wp:docPr id="12" name="Picture 12"/>
             <wp:cNvGraphicFramePr>
               <a:graphicFrameLocks noChangeAspect="1"/>
             </wp:cNvGraphicFramePr>
@@ -13032,7 +13352,7 @@
                     <pic:cNvPicPr/>
                   </pic:nvPicPr>
                   <pic:blipFill>
-                    <a:blip r:embed="rId18"/>
+                    <a:blip r:embed="rId19"/>
                     <a:stretch>
                       <a:fillRect/>
                     </a:stretch>
@@ -13245,7 +13565,7 @@
         <w:drawing>
           <wp:inline xmlns:a="http://schemas.openxmlformats.org/drawingml/2006/main" xmlns:pic="http://schemas.openxmlformats.org/drawingml/2006/picture">
             <wp:extent cx="5029200" cy="1745778"/>
-            <wp:docPr id="11" name="Picture 11"/>
+            <wp:docPr id="13" name="Picture 13"/>
             <wp:cNvGraphicFramePr>
               <a:graphicFrameLocks noChangeAspect="1"/>
             </wp:cNvGraphicFramePr>
@@ -13257,7 +13577,7 @@
                     <pic:cNvPicPr/>
                   </pic:nvPicPr>
                   <pic:blipFill>
-                    <a:blip r:embed="rId19"/>
+                    <a:blip r:embed="rId20"/>
                     <a:stretch>
                       <a:fillRect/>
                     </a:stretch>
@@ -13587,7 +13907,7 @@
         <w:drawing>
           <wp:inline xmlns:a="http://schemas.openxmlformats.org/drawingml/2006/main" xmlns:pic="http://schemas.openxmlformats.org/drawingml/2006/picture">
             <wp:extent cx="2596896" cy="5304298"/>
-            <wp:docPr id="12" name="Picture 12"/>
+            <wp:docPr id="14" name="Picture 14"/>
             <wp:cNvGraphicFramePr>
               <a:graphicFrameLocks noChangeAspect="1"/>
             </wp:cNvGraphicFramePr>
@@ -13599,7 +13919,7 @@
                     <pic:cNvPicPr/>
                   </pic:nvPicPr>
                   <pic:blipFill>
-                    <a:blip r:embed="rId20"/>
+                    <a:blip r:embed="rId21"/>
                     <a:stretch>
                       <a:fillRect/>
                     </a:stretch>
@@ -14248,7 +14568,7 @@
         <w:drawing>
           <wp:inline xmlns:a="http://schemas.openxmlformats.org/drawingml/2006/main" xmlns:pic="http://schemas.openxmlformats.org/drawingml/2006/picture">
             <wp:extent cx="5029200" cy="3050116"/>
-            <wp:docPr id="13" name="Picture 13"/>
+            <wp:docPr id="15" name="Picture 15"/>
             <wp:cNvGraphicFramePr>
               <a:graphicFrameLocks noChangeAspect="1"/>
             </wp:cNvGraphicFramePr>
@@ -14260,7 +14580,7 @@
                     <pic:cNvPicPr/>
                   </pic:nvPicPr>
                   <pic:blipFill>
-                    <a:blip r:embed="rId21"/>
+                    <a:blip r:embed="rId22"/>
                     <a:stretch>
                       <a:fillRect/>
                     </a:stretch>
@@ -14432,7 +14752,7 @@
         <w:drawing>
           <wp:inline xmlns:a="http://schemas.openxmlformats.org/drawingml/2006/main" xmlns:pic="http://schemas.openxmlformats.org/drawingml/2006/picture">
             <wp:extent cx="5029200" cy="2064782"/>
-            <wp:docPr id="14" name="Picture 14"/>
+            <wp:docPr id="16" name="Picture 16"/>
             <wp:cNvGraphicFramePr>
               <a:graphicFrameLocks noChangeAspect="1"/>
             </wp:cNvGraphicFramePr>
@@ -14444,7 +14764,7 @@
                     <pic:cNvPicPr/>
                   </pic:nvPicPr>
                   <pic:blipFill>
-                    <a:blip r:embed="rId22"/>
+                    <a:blip r:embed="rId23"/>
                     <a:stretch>
                       <a:fillRect/>
                     </a:stretch>
@@ -15436,7 +15756,7 @@
         <w:drawing>
           <wp:inline xmlns:a="http://schemas.openxmlformats.org/drawingml/2006/main" xmlns:pic="http://schemas.openxmlformats.org/drawingml/2006/picture">
             <wp:extent cx="5029200" cy="639551"/>
-            <wp:docPr id="15" name="Picture 15"/>
+            <wp:docPr id="17" name="Picture 17"/>
             <wp:cNvGraphicFramePr>
               <a:graphicFrameLocks noChangeAspect="1"/>
             </wp:cNvGraphicFramePr>
@@ -15448,7 +15768,7 @@
                     <pic:cNvPicPr/>
                   </pic:nvPicPr>
                   <pic:blipFill>
-                    <a:blip r:embed="rId23"/>
+                    <a:blip r:embed="rId24"/>
                     <a:stretch>
                       <a:fillRect/>
                     </a:stretch>
@@ -15584,7 +15904,7 @@
         <w:drawing>
           <wp:inline xmlns:a="http://schemas.openxmlformats.org/drawingml/2006/main" xmlns:pic="http://schemas.openxmlformats.org/drawingml/2006/picture">
             <wp:extent cx="5029200" cy="4396303"/>
-            <wp:docPr id="16" name="Picture 16"/>
+            <wp:docPr id="18" name="Picture 18"/>
             <wp:cNvGraphicFramePr>
               <a:graphicFrameLocks noChangeAspect="1"/>
             </wp:cNvGraphicFramePr>
@@ -15596,7 +15916,7 @@
                     <pic:cNvPicPr/>
                   </pic:nvPicPr>
                   <pic:blipFill>
-                    <a:blip r:embed="rId24"/>
+                    <a:blip r:embed="rId25"/>
                     <a:stretch>
                       <a:fillRect/>
                     </a:stretch>
@@ -15831,7 +16151,7 @@
         <w:drawing>
           <wp:inline xmlns:a="http://schemas.openxmlformats.org/drawingml/2006/main" xmlns:pic="http://schemas.openxmlformats.org/drawingml/2006/picture">
             <wp:extent cx="3738981" cy="5303121"/>
-            <wp:docPr id="17" name="Picture 17"/>
+            <wp:docPr id="19" name="Picture 19"/>
             <wp:cNvGraphicFramePr>
               <a:graphicFrameLocks noChangeAspect="1"/>
             </wp:cNvGraphicFramePr>
@@ -15843,7 +16163,7 @@
                     <pic:cNvPicPr/>
                   </pic:nvPicPr>
                   <pic:blipFill>
-                    <a:blip r:embed="rId25"/>
+                    <a:blip r:embed="rId26"/>
                     <a:stretch>
                       <a:fillRect/>
                     </a:stretch>
@@ -18830,7 +19150,7 @@
         <w:drawing>
           <wp:inline xmlns:a="http://schemas.openxmlformats.org/drawingml/2006/main" xmlns:pic="http://schemas.openxmlformats.org/drawingml/2006/picture">
             <wp:extent cx="5029200" cy="3125395"/>
-            <wp:docPr id="18" name="Picture 18"/>
+            <wp:docPr id="20" name="Picture 20"/>
             <wp:cNvGraphicFramePr>
               <a:graphicFrameLocks noChangeAspect="1"/>
             </wp:cNvGraphicFramePr>
@@ -18842,7 +19162,7 @@
                     <pic:cNvPicPr/>
                   </pic:nvPicPr>
                   <pic:blipFill>
-                    <a:blip r:embed="rId26"/>
+                    <a:blip r:embed="rId27"/>
                     <a:stretch>
                       <a:fillRect/>
                     </a:stretch>
@@ -19580,7 +19900,7 @@
         <w:drawing>
           <wp:inline xmlns:a="http://schemas.openxmlformats.org/drawingml/2006/main" xmlns:pic="http://schemas.openxmlformats.org/drawingml/2006/picture">
             <wp:extent cx="5029200" cy="2177344"/>
-            <wp:docPr id="19" name="Picture 19"/>
+            <wp:docPr id="21" name="Picture 21"/>
             <wp:cNvGraphicFramePr>
               <a:graphicFrameLocks noChangeAspect="1"/>
             </wp:cNvGraphicFramePr>
@@ -19592,7 +19912,7 @@
                     <pic:cNvPicPr/>
                   </pic:nvPicPr>
                   <pic:blipFill>
-                    <a:blip r:embed="rId27"/>
+                    <a:blip r:embed="rId28"/>
                     <a:stretch>
                       <a:fillRect/>
                     </a:stretch>
@@ -20570,7 +20890,7 @@
         <w:drawing>
           <wp:inline xmlns:a="http://schemas.openxmlformats.org/drawingml/2006/main" xmlns:pic="http://schemas.openxmlformats.org/drawingml/2006/picture">
             <wp:extent cx="5029200" cy="2182190"/>
-            <wp:docPr id="20" name="Picture 20"/>
+            <wp:docPr id="22" name="Picture 22"/>
             <wp:cNvGraphicFramePr>
               <a:graphicFrameLocks noChangeAspect="1"/>
             </wp:cNvGraphicFramePr>
@@ -20582,7 +20902,7 @@
                     <pic:cNvPicPr/>
                   </pic:nvPicPr>
                   <pic:blipFill>
-                    <a:blip r:embed="rId28"/>
+                    <a:blip r:embed="rId29"/>
                     <a:stretch>
                       <a:fillRect/>
                     </a:stretch>
@@ -21607,7 +21927,7 @@
         <w:drawing>
           <wp:inline xmlns:a="http://schemas.openxmlformats.org/drawingml/2006/main" xmlns:pic="http://schemas.openxmlformats.org/drawingml/2006/picture">
             <wp:extent cx="5029200" cy="2009598"/>
-            <wp:docPr id="21" name="Picture 21"/>
+            <wp:docPr id="23" name="Picture 23"/>
             <wp:cNvGraphicFramePr>
               <a:graphicFrameLocks noChangeAspect="1"/>
             </wp:cNvGraphicFramePr>
@@ -21619,7 +21939,7 @@
                     <pic:cNvPicPr/>
                   </pic:nvPicPr>
                   <pic:blipFill>
-                    <a:blip r:embed="rId29"/>
+                    <a:blip r:embed="rId30"/>
                     <a:stretch>
                       <a:fillRect/>
                     </a:stretch>

</xml_diff>

<commit_message>
page  umber alignment changed
</commit_message>
<xml_diff>
--- a/Multimodal_AI_Research_Assistant_Report.docx
+++ b/Multimodal_AI_Research_Assistant_Report.docx
@@ -4188,6 +4188,7 @@
       <w:pPr>
         <w:sectPr>
           <w:type w:val="nextPage"/>
+          <w:pgNumType w:fmt="lowerRoman" w:start="1"/>
         </w:sectPr>
       </w:pPr>
       <w:r>
@@ -4696,6 +4697,7 @@
           <w:headerReference w:type="default" r:id="rId31"/>
           <w:footerReference w:type="default" r:id="rId32"/>
           <w:type w:val="nextPage"/>
+          <w:pgNumType w:fmt="decimal" w:start="1"/>
         </w:sectPr>
       </w:pPr>
       <w:r>
@@ -6225,6 +6227,7 @@
           <w:headerReference w:type="default" r:id="rId33"/>
           <w:footerReference w:type="default" r:id="rId34"/>
           <w:type w:val="nextPage"/>
+          <w:pgNumType w:fmt="decimal"/>
         </w:sectPr>
       </w:pPr>
       <w:r>
@@ -9974,6 +9977,7 @@
           <w:headerReference w:type="default" r:id="rId35"/>
           <w:footerReference w:type="default" r:id="rId36"/>
           <w:type w:val="nextPage"/>
+          <w:pgNumType w:fmt="decimal"/>
         </w:sectPr>
       </w:pPr>
       <w:r>
@@ -12569,6 +12573,7 @@
           <w:headerReference w:type="default" r:id="rId37"/>
           <w:footerReference w:type="default" r:id="rId38"/>
           <w:type w:val="nextPage"/>
+          <w:pgNumType w:fmt="decimal"/>
         </w:sectPr>
       </w:pPr>
       <w:r>
@@ -15708,6 +15713,7 @@
           <w:headerReference w:type="default" r:id="rId39"/>
           <w:footerReference w:type="default" r:id="rId40"/>
           <w:type w:val="nextPage"/>
+          <w:pgNumType w:fmt="decimal"/>
         </w:sectPr>
       </w:pPr>
       <w:r>
@@ -18153,6 +18159,7 @@
           <w:headerReference w:type="default" r:id="rId41"/>
           <w:footerReference w:type="default" r:id="rId42"/>
           <w:type w:val="nextPage"/>
+          <w:pgNumType w:fmt="decimal"/>
         </w:sectPr>
       </w:pPr>
       <w:r>
@@ -20937,6 +20944,7 @@
           <w:headerReference w:type="default" r:id="rId43"/>
           <w:footerReference w:type="default" r:id="rId44"/>
           <w:type w:val="nextPage"/>
+          <w:pgNumType w:fmt="decimal"/>
         </w:sectPr>
       </w:pPr>
       <w:r>
@@ -21301,6 +21309,7 @@
           <w:headerReference w:type="default" r:id="rId45"/>
           <w:footerReference w:type="default" r:id="rId46"/>
           <w:type w:val="nextPage"/>
+          <w:pgNumType w:fmt="decimal"/>
         </w:sectPr>
       </w:pPr>
       <w:r>
@@ -21704,6 +21713,7 @@
       <w:pgMar w:top="1440" w:right="1440" w:bottom="1440" w:left="1800" w:header="720" w:footer="720" w:gutter="0"/>
       <w:cols w:space="720"/>
       <w:docGrid w:linePitch="360"/>
+      <w:pgNumType w:fmt="decimal"/>
     </w:sectPr>
   </w:body>
 </w:document>
@@ -21718,15 +21728,20 @@
       <w:pBdr>
         <w:top w:val="single" w:sz="6" w:space="1" w:color="000000"/>
       </w:pBdr>
+      <w:spacing w:before="120"/>
       <w:tabs>
+        <w:tab w:val="center" w:pos="4500"/>
         <w:tab w:val="right" w:pos="9000"/>
       </w:tabs>
-      <w:spacing w:before="120"/>
     </w:pPr>
     <w:r>
+      <w:tab/>
+    </w:r>
+    <w:r>
       <w:rPr>
         <w:rFonts w:ascii="Times New Roman" w:hAnsi="Times New Roman"/>
         <w:sz w:val="24"/>
+        <w:szCs w:val="24"/>
       </w:rPr>
       <w:t xml:space="preserve">Page | </w:t>
     </w:r>
@@ -21740,18 +21755,15 @@
       <w:fldChar w:fldCharType="end"/>
     </w:r>
     <w:r>
-      <w:rPr>
-        <w:rFonts w:ascii="Times New Roman" w:hAnsi="Times New Roman"/>
-        <w:sz w:val="24"/>
-      </w:rPr>
       <w:tab/>
     </w:r>
     <w:r>
       <w:rPr>
         <w:rFonts w:ascii="Times New Roman" w:hAnsi="Times New Roman"/>
         <w:sz w:val="24"/>
-      </w:rPr>
-      <w:t>Dept. of CSE, ASC, Bengaluru</w:t>
+        <w:szCs w:val="24"/>
+      </w:rPr>
+      <w:t xml:space="preserve">Dept. of CSE, ASC, Bengaluru</w:t>
     </w:r>
   </w:p>
 </w:ftr>
@@ -21766,15 +21778,20 @@
       <w:pBdr>
         <w:top w:val="single" w:sz="6" w:space="1" w:color="000000"/>
       </w:pBdr>
+      <w:spacing w:before="120"/>
       <w:tabs>
+        <w:tab w:val="center" w:pos="4500"/>
         <w:tab w:val="right" w:pos="9000"/>
       </w:tabs>
-      <w:spacing w:before="120"/>
     </w:pPr>
     <w:r>
+      <w:tab/>
+    </w:r>
+    <w:r>
       <w:rPr>
         <w:rFonts w:ascii="Times New Roman" w:hAnsi="Times New Roman"/>
         <w:sz w:val="24"/>
+        <w:szCs w:val="24"/>
       </w:rPr>
       <w:t xml:space="preserve">Page | </w:t>
     </w:r>
@@ -21788,18 +21805,15 @@
       <w:fldChar w:fldCharType="end"/>
     </w:r>
     <w:r>
-      <w:rPr>
-        <w:rFonts w:ascii="Times New Roman" w:hAnsi="Times New Roman"/>
-        <w:sz w:val="24"/>
-      </w:rPr>
       <w:tab/>
     </w:r>
     <w:r>
       <w:rPr>
         <w:rFonts w:ascii="Times New Roman" w:hAnsi="Times New Roman"/>
         <w:sz w:val="24"/>
-      </w:rPr>
-      <w:t>Dept. of CSE, ASC, Bengaluru</w:t>
+        <w:szCs w:val="24"/>
+      </w:rPr>
+      <w:t xml:space="preserve">Dept. of CSE, ASC, Bengaluru</w:t>
     </w:r>
   </w:p>
 </w:ftr>
@@ -21814,15 +21828,20 @@
       <w:pBdr>
         <w:top w:val="single" w:sz="6" w:space="1" w:color="000000"/>
       </w:pBdr>
+      <w:spacing w:before="120"/>
       <w:tabs>
+        <w:tab w:val="center" w:pos="4500"/>
         <w:tab w:val="right" w:pos="9000"/>
       </w:tabs>
-      <w:spacing w:before="120"/>
     </w:pPr>
     <w:r>
+      <w:tab/>
+    </w:r>
+    <w:r>
       <w:rPr>
         <w:rFonts w:ascii="Times New Roman" w:hAnsi="Times New Roman"/>
         <w:sz w:val="24"/>
+        <w:szCs w:val="24"/>
       </w:rPr>
       <w:t xml:space="preserve">Page | </w:t>
     </w:r>
@@ -21836,18 +21855,15 @@
       <w:fldChar w:fldCharType="end"/>
     </w:r>
     <w:r>
-      <w:rPr>
-        <w:rFonts w:ascii="Times New Roman" w:hAnsi="Times New Roman"/>
-        <w:sz w:val="24"/>
-      </w:rPr>
       <w:tab/>
     </w:r>
     <w:r>
       <w:rPr>
         <w:rFonts w:ascii="Times New Roman" w:hAnsi="Times New Roman"/>
         <w:sz w:val="24"/>
-      </w:rPr>
-      <w:t>Dept. of CSE, ASC, Bengaluru</w:t>
+        <w:szCs w:val="24"/>
+      </w:rPr>
+      <w:t xml:space="preserve">Dept. of CSE, ASC, Bengaluru</w:t>
     </w:r>
   </w:p>
 </w:ftr>
@@ -21862,15 +21878,20 @@
       <w:pBdr>
         <w:top w:val="single" w:sz="6" w:space="1" w:color="000000"/>
       </w:pBdr>
+      <w:spacing w:before="120"/>
       <w:tabs>
+        <w:tab w:val="center" w:pos="4500"/>
         <w:tab w:val="right" w:pos="9000"/>
       </w:tabs>
-      <w:spacing w:before="120"/>
     </w:pPr>
     <w:r>
+      <w:tab/>
+    </w:r>
+    <w:r>
       <w:rPr>
         <w:rFonts w:ascii="Times New Roman" w:hAnsi="Times New Roman"/>
         <w:sz w:val="24"/>
+        <w:szCs w:val="24"/>
       </w:rPr>
       <w:t xml:space="preserve">Page | </w:t>
     </w:r>
@@ -21884,18 +21905,15 @@
       <w:fldChar w:fldCharType="end"/>
     </w:r>
     <w:r>
-      <w:rPr>
-        <w:rFonts w:ascii="Times New Roman" w:hAnsi="Times New Roman"/>
-        <w:sz w:val="24"/>
-      </w:rPr>
       <w:tab/>
     </w:r>
     <w:r>
       <w:rPr>
         <w:rFonts w:ascii="Times New Roman" w:hAnsi="Times New Roman"/>
         <w:sz w:val="24"/>
-      </w:rPr>
-      <w:t>Dept. of CSE, ASC, Bengaluru</w:t>
+        <w:szCs w:val="24"/>
+      </w:rPr>
+      <w:t xml:space="preserve">Dept. of CSE, ASC, Bengaluru</w:t>
     </w:r>
   </w:p>
 </w:ftr>
@@ -21910,15 +21928,20 @@
       <w:pBdr>
         <w:top w:val="single" w:sz="6" w:space="1" w:color="000000"/>
       </w:pBdr>
+      <w:spacing w:before="120"/>
       <w:tabs>
+        <w:tab w:val="center" w:pos="4500"/>
         <w:tab w:val="right" w:pos="9000"/>
       </w:tabs>
-      <w:spacing w:before="120"/>
     </w:pPr>
     <w:r>
+      <w:tab/>
+    </w:r>
+    <w:r>
       <w:rPr>
         <w:rFonts w:ascii="Times New Roman" w:hAnsi="Times New Roman"/>
         <w:sz w:val="24"/>
+        <w:szCs w:val="24"/>
       </w:rPr>
       <w:t xml:space="preserve">Page | </w:t>
     </w:r>
@@ -21932,18 +21955,15 @@
       <w:fldChar w:fldCharType="end"/>
     </w:r>
     <w:r>
-      <w:rPr>
-        <w:rFonts w:ascii="Times New Roman" w:hAnsi="Times New Roman"/>
-        <w:sz w:val="24"/>
-      </w:rPr>
       <w:tab/>
     </w:r>
     <w:r>
       <w:rPr>
         <w:rFonts w:ascii="Times New Roman" w:hAnsi="Times New Roman"/>
         <w:sz w:val="24"/>
-      </w:rPr>
-      <w:t>Dept. of CSE, ASC, Bengaluru</w:t>
+        <w:szCs w:val="24"/>
+      </w:rPr>
+      <w:t xml:space="preserve">Dept. of CSE, ASC, Bengaluru</w:t>
     </w:r>
   </w:p>
 </w:ftr>
@@ -21958,15 +21978,20 @@
       <w:pBdr>
         <w:top w:val="single" w:sz="6" w:space="1" w:color="000000"/>
       </w:pBdr>
+      <w:spacing w:before="120"/>
       <w:tabs>
+        <w:tab w:val="center" w:pos="4500"/>
         <w:tab w:val="right" w:pos="9000"/>
       </w:tabs>
-      <w:spacing w:before="120"/>
     </w:pPr>
     <w:r>
+      <w:tab/>
+    </w:r>
+    <w:r>
       <w:rPr>
         <w:rFonts w:ascii="Times New Roman" w:hAnsi="Times New Roman"/>
         <w:sz w:val="24"/>
+        <w:szCs w:val="24"/>
       </w:rPr>
       <w:t xml:space="preserve">Page | </w:t>
     </w:r>
@@ -21980,18 +22005,15 @@
       <w:fldChar w:fldCharType="end"/>
     </w:r>
     <w:r>
-      <w:rPr>
-        <w:rFonts w:ascii="Times New Roman" w:hAnsi="Times New Roman"/>
-        <w:sz w:val="24"/>
-      </w:rPr>
       <w:tab/>
     </w:r>
     <w:r>
       <w:rPr>
         <w:rFonts w:ascii="Times New Roman" w:hAnsi="Times New Roman"/>
         <w:sz w:val="24"/>
-      </w:rPr>
-      <w:t>Dept. of CSE, ASC, Bengaluru</w:t>
+        <w:szCs w:val="24"/>
+      </w:rPr>
+      <w:t xml:space="preserve">Dept. of CSE, ASC, Bengaluru</w:t>
     </w:r>
   </w:p>
 </w:ftr>
@@ -22006,15 +22028,20 @@
       <w:pBdr>
         <w:top w:val="single" w:sz="6" w:space="1" w:color="000000"/>
       </w:pBdr>
+      <w:spacing w:before="120"/>
       <w:tabs>
+        <w:tab w:val="center" w:pos="4500"/>
         <w:tab w:val="right" w:pos="9000"/>
       </w:tabs>
-      <w:spacing w:before="120"/>
     </w:pPr>
     <w:r>
+      <w:tab/>
+    </w:r>
+    <w:r>
       <w:rPr>
         <w:rFonts w:ascii="Times New Roman" w:hAnsi="Times New Roman"/>
         <w:sz w:val="24"/>
+        <w:szCs w:val="24"/>
       </w:rPr>
       <w:t xml:space="preserve">Page | </w:t>
     </w:r>
@@ -22028,18 +22055,15 @@
       <w:fldChar w:fldCharType="end"/>
     </w:r>
     <w:r>
-      <w:rPr>
-        <w:rFonts w:ascii="Times New Roman" w:hAnsi="Times New Roman"/>
-        <w:sz w:val="24"/>
-      </w:rPr>
       <w:tab/>
     </w:r>
     <w:r>
       <w:rPr>
         <w:rFonts w:ascii="Times New Roman" w:hAnsi="Times New Roman"/>
         <w:sz w:val="24"/>
-      </w:rPr>
-      <w:t>Dept. of CSE, ASC, Bengaluru</w:t>
+        <w:szCs w:val="24"/>
+      </w:rPr>
+      <w:t xml:space="preserve">Dept. of CSE, ASC, Bengaluru</w:t>
     </w:r>
   </w:p>
 </w:ftr>
@@ -22054,15 +22078,20 @@
       <w:pBdr>
         <w:top w:val="single" w:sz="6" w:space="1" w:color="000000"/>
       </w:pBdr>
+      <w:spacing w:before="120"/>
       <w:tabs>
+        <w:tab w:val="center" w:pos="4500"/>
         <w:tab w:val="right" w:pos="9000"/>
       </w:tabs>
-      <w:spacing w:before="120"/>
     </w:pPr>
     <w:r>
+      <w:tab/>
+    </w:r>
+    <w:r>
       <w:rPr>
         <w:rFonts w:ascii="Times New Roman" w:hAnsi="Times New Roman"/>
         <w:sz w:val="24"/>
+        <w:szCs w:val="24"/>
       </w:rPr>
       <w:t xml:space="preserve">Page | </w:t>
     </w:r>
@@ -22076,18 +22105,15 @@
       <w:fldChar w:fldCharType="end"/>
     </w:r>
     <w:r>
-      <w:rPr>
-        <w:rFonts w:ascii="Times New Roman" w:hAnsi="Times New Roman"/>
-        <w:sz w:val="24"/>
-      </w:rPr>
       <w:tab/>
     </w:r>
     <w:r>
       <w:rPr>
         <w:rFonts w:ascii="Times New Roman" w:hAnsi="Times New Roman"/>
         <w:sz w:val="24"/>
-      </w:rPr>
-      <w:t>Dept. of CSE, ASC, Bengaluru</w:t>
+        <w:szCs w:val="24"/>
+      </w:rPr>
+      <w:t xml:space="preserve">Dept. of CSE, ASC, Bengaluru</w:t>
     </w:r>
   </w:p>
 </w:ftr>
@@ -22102,15 +22128,20 @@
       <w:pBdr>
         <w:top w:val="single" w:sz="6" w:space="1" w:color="000000"/>
       </w:pBdr>
+      <w:spacing w:before="120"/>
       <w:tabs>
+        <w:tab w:val="center" w:pos="4500"/>
         <w:tab w:val="right" w:pos="9000"/>
       </w:tabs>
-      <w:spacing w:before="120"/>
     </w:pPr>
     <w:r>
+      <w:tab/>
+    </w:r>
+    <w:r>
       <w:rPr>
         <w:rFonts w:ascii="Times New Roman" w:hAnsi="Times New Roman"/>
         <w:sz w:val="24"/>
+        <w:szCs w:val="24"/>
       </w:rPr>
       <w:t xml:space="preserve">Page | </w:t>
     </w:r>
@@ -22124,18 +22155,15 @@
       <w:fldChar w:fldCharType="end"/>
     </w:r>
     <w:r>
-      <w:rPr>
-        <w:rFonts w:ascii="Times New Roman" w:hAnsi="Times New Roman"/>
-        <w:sz w:val="24"/>
-      </w:rPr>
       <w:tab/>
     </w:r>
     <w:r>
       <w:rPr>
         <w:rFonts w:ascii="Times New Roman" w:hAnsi="Times New Roman"/>
         <w:sz w:val="24"/>
-      </w:rPr>
-      <w:t>Dept. of CSE, ASC, Bengaluru</w:t>
+        <w:szCs w:val="24"/>
+      </w:rPr>
+      <w:t xml:space="preserve">Dept. of CSE, ASC, Bengaluru</w:t>
     </w:r>
   </w:p>
 </w:ftr>

</xml_diff>

<commit_message>
added roman numbers for the first pages
</commit_message>
<xml_diff>
--- a/Multimodal_AI_Research_Assistant_Report.docx
+++ b/Multimodal_AI_Research_Assistant_Report.docx
@@ -305,6 +305,13 @@
       </w:r>
     </w:p>
     <w:p>
+      <w:pPr>
+        <w:sectPr>
+          <w:headerReference w:type="default" r:id="rId49"/>
+          <w:footerReference w:type="default" r:id="rId50"/>
+          <w:type w:val="nextPage"/>
+        </w:sectPr>
+      </w:pPr>
       <w:r>
         <w:br w:type="page"/>
       </w:r>
@@ -1009,20 +1016,6 @@
       </w:r>
     </w:p>
     <w:p>
-      <w:pPr>
-        <w:jc w:val="center"/>
-      </w:pPr>
-      <w:r>
-        <w:rPr>
-          <w:rFonts w:ascii="Times New Roman" w:hAnsi="Times New Roman"/>
-          <w:b w:val="0"/>
-          <w:i/>
-          <w:sz w:val="24"/>
-        </w:rPr>
-        <w:t>I</w:t>
-      </w:r>
-    </w:p>
-    <w:p>
       <w:r>
         <w:br w:type="page"/>
       </w:r>
@@ -1104,19 +1097,13 @@
     </w:p>
     <w:p>
       <w:pPr>
-        <w:jc w:val="center"/>
-      </w:pPr>
-      <w:r>
-        <w:rPr>
-          <w:rFonts w:ascii="Times New Roman" w:hAnsi="Times New Roman"/>
-          <w:b w:val="0"/>
-          <w:i/>
-          <w:sz w:val="24"/>
-        </w:rPr>
-        <w:t>II</w:t>
-      </w:r>
-    </w:p>
-    <w:p>
+        <w:sectPr>
+          <w:headerReference w:type="default" r:id="rId51"/>
+          <w:footerReference w:type="default" r:id="rId52"/>
+          <w:type w:val="nextPage"/>
+          <w:pgNumType w:fmt="lowerRoman" w:start="1"/>
+        </w:sectPr>
+      </w:pPr>
       <w:r>
         <w:br w:type="page"/>
       </w:r>
@@ -2952,19 +2939,16 @@
     </w:p>
     <w:p>
       <w:pPr>
-        <w:jc w:val="center"/>
-      </w:pPr>
-      <w:r>
-        <w:rPr>
-          <w:rFonts w:ascii="Times New Roman" w:hAnsi="Times New Roman"/>
-          <w:b w:val="0"/>
-          <w:i/>
-          <w:sz w:val="24"/>
-        </w:rPr>
-        <w:t>III</w:t>
-      </w:r>
-    </w:p>
-    <w:p>
+        <w:sectPr>
+          <w:headerReference w:type="default" r:id="rId53"/>
+          <w:footerReference w:type="default" r:id="rId54"/>
+          <w:headerReference w:type="first" r:id="rId55"/>
+          <w:footerReference w:type="first" r:id="rId56"/>
+          <w:type w:val="nextPage"/>
+          <w:pgNumType w:fmt="lowerRoman"/>
+          <w:titlePg/>
+        </w:sectPr>
+      </w:pPr>
       <w:r>
         <w:br w:type="page"/>
       </w:r>
@@ -3658,19 +3642,16 @@
     </w:p>
     <w:p>
       <w:pPr>
-        <w:jc w:val="center"/>
-      </w:pPr>
-      <w:r>
-        <w:rPr>
-          <w:rFonts w:ascii="Times New Roman" w:hAnsi="Times New Roman"/>
-          <w:b w:val="0"/>
-          <w:i/>
-          <w:sz w:val="24"/>
-        </w:rPr>
-        <w:t>V</w:t>
-      </w:r>
-    </w:p>
-    <w:p>
+        <w:sectPr>
+          <w:headerReference w:type="default" r:id="rId57"/>
+          <w:footerReference w:type="default" r:id="rId58"/>
+          <w:headerReference w:type="first" r:id="rId59"/>
+          <w:footerReference w:type="first" r:id="rId60"/>
+          <w:type w:val="nextPage"/>
+          <w:pgNumType w:fmt="lowerRoman"/>
+          <w:titlePg/>
+        </w:sectPr>
+      </w:pPr>
       <w:r>
         <w:br w:type="page"/>
       </w:r>
@@ -4172,23 +4153,14 @@
     </w:p>
     <w:p>
       <w:pPr>
-        <w:jc w:val="center"/>
-      </w:pPr>
-      <w:r>
-        <w:rPr>
-          <w:rFonts w:ascii="Times New Roman" w:hAnsi="Times New Roman"/>
-          <w:b w:val="0"/>
-          <w:i/>
-          <w:sz w:val="24"/>
-        </w:rPr>
-        <w:t>VI</w:t>
-      </w:r>
-    </w:p>
-    <w:p>
-      <w:pPr>
         <w:sectPr>
+          <w:headerReference w:type="default" r:id="rId61"/>
+          <w:footerReference w:type="default" r:id="rId62"/>
+          <w:headerReference w:type="first" r:id="rId63"/>
+          <w:footerReference w:type="first" r:id="rId64"/>
           <w:type w:val="nextPage"/>
-          <w:pgNumType w:fmt="lowerRoman" w:start="1"/>
+          <w:pgNumType w:fmt="lowerRoman"/>
+          <w:titlePg/>
         </w:sectPr>
       </w:pPr>
       <w:r>
@@ -21769,6 +21741,166 @@
 </w:ftr>
 </file>
 
+<file path=word/footer10.xml><?xml version="1.0" encoding="utf-8"?>
+<w:ftr xmlns:m="http://schemas.openxmlformats.org/officeDocument/2006/math" xmlns:mc="http://schemas.openxmlformats.org/markup-compatibility/2006" xmlns:mo="http://schemas.microsoft.com/office/mac/office/2008/main" xmlns:mv="urn:schemas-microsoft-com:mac:vml" xmlns:o="urn:schemas-microsoft-com:office:office" xmlns:r="http://schemas.openxmlformats.org/officeDocument/2006/relationships" xmlns:v="urn:schemas-microsoft-com:vml" xmlns:w10="urn:schemas-microsoft-com:office:word" xmlns:w14="http://schemas.microsoft.com/office/word/2010/wordml" xmlns:w="http://schemas.openxmlformats.org/wordprocessingml/2006/main" xmlns:wne="http://schemas.microsoft.com/office/word/2006/wordml" xmlns:wp14="http://schemas.microsoft.com/office/word/2010/wordprocessingDrawing" xmlns:wp="http://schemas.openxmlformats.org/drawingml/2006/wordprocessingDrawing" xmlns:wpc="http://schemas.microsoft.com/office/word/2010/wordprocessingCanvas" xmlns:wpg="http://schemas.microsoft.com/office/word/2010/wordprocessingGroup" xmlns:wpi="http://schemas.microsoft.com/office/word/2010/wordprocessingInk" xmlns:wps="http://schemas.microsoft.com/office/word/2010/wordprocessingShape" mc:Ignorable="w14 wp14">
+  <w:p>
+    <w:pPr>
+      <w:pStyle w:val="Footer"/>
+      <w:jc w:val="center"/>
+    </w:pPr>
+  </w:p>
+</w:ftr>
+</file>
+
+<file path=word/footer11.xml><?xml version="1.0" encoding="utf-8"?>
+<w:ftr xmlns:m="http://schemas.openxmlformats.org/officeDocument/2006/math" xmlns:mc="http://schemas.openxmlformats.org/markup-compatibility/2006" xmlns:mo="http://schemas.microsoft.com/office/mac/office/2008/main" xmlns:mv="urn:schemas-microsoft-com:mac:vml" xmlns:o="urn:schemas-microsoft-com:office:office" xmlns:r="http://schemas.openxmlformats.org/officeDocument/2006/relationships" xmlns:v="urn:schemas-microsoft-com:vml" xmlns:w10="urn:schemas-microsoft-com:office:word" xmlns:w14="http://schemas.microsoft.com/office/word/2010/wordml" xmlns:w="http://schemas.openxmlformats.org/wordprocessingml/2006/main" xmlns:wne="http://schemas.microsoft.com/office/word/2006/wordml" xmlns:wp14="http://schemas.microsoft.com/office/word/2010/wordprocessingDrawing" xmlns:wp="http://schemas.openxmlformats.org/drawingml/2006/wordprocessingDrawing" xmlns:wpc="http://schemas.microsoft.com/office/word/2010/wordprocessingCanvas" xmlns:wpg="http://schemas.microsoft.com/office/word/2010/wordprocessingGroup" xmlns:wpi="http://schemas.microsoft.com/office/word/2010/wordprocessingInk" xmlns:wps="http://schemas.microsoft.com/office/word/2010/wordprocessingShape" mc:Ignorable="w14 wp14">
+  <w:p>
+    <w:pPr>
+      <w:pStyle w:val="Footer"/>
+      <w:jc w:val="center"/>
+    </w:pPr>
+    <w:r>
+      <w:fldChar w:fldCharType="begin"/>
+    </w:r>
+    <w:r>
+      <w:instrText xml:space="preserve"> PAGE </w:instrText>
+    </w:r>
+    <w:r>
+      <w:fldChar w:fldCharType="end"/>
+    </w:r>
+  </w:p>
+</w:ftr>
+</file>
+
+<file path=word/footer12.xml><?xml version="1.0" encoding="utf-8"?>
+<w:ftr xmlns:m="http://schemas.openxmlformats.org/officeDocument/2006/math" xmlns:mc="http://schemas.openxmlformats.org/markup-compatibility/2006" xmlns:mo="http://schemas.microsoft.com/office/mac/office/2008/main" xmlns:mv="urn:schemas-microsoft-com:mac:vml" xmlns:o="urn:schemas-microsoft-com:office:office" xmlns:r="http://schemas.openxmlformats.org/officeDocument/2006/relationships" xmlns:v="urn:schemas-microsoft-com:vml" xmlns:w10="urn:schemas-microsoft-com:office:word" xmlns:w14="http://schemas.microsoft.com/office/word/2010/wordml" xmlns:w="http://schemas.openxmlformats.org/wordprocessingml/2006/main" xmlns:wne="http://schemas.microsoft.com/office/word/2006/wordml" xmlns:wp14="http://schemas.microsoft.com/office/word/2010/wordprocessingDrawing" xmlns:wp="http://schemas.openxmlformats.org/drawingml/2006/wordprocessingDrawing" xmlns:wpc="http://schemas.microsoft.com/office/word/2010/wordprocessingCanvas" xmlns:wpg="http://schemas.microsoft.com/office/word/2010/wordprocessingGroup" xmlns:wpi="http://schemas.microsoft.com/office/word/2010/wordprocessingInk" xmlns:wps="http://schemas.microsoft.com/office/word/2010/wordprocessingShape" mc:Ignorable="w14 wp14">
+  <w:p>
+    <w:pPr>
+      <w:pStyle w:val="Footer"/>
+      <w:jc w:val="center"/>
+      <w:pBdr>
+        <w:top w:val="single" w:sz="6" w:space="1" w:color="000000"/>
+      </w:pBdr>
+    </w:pPr>
+    <w:r>
+      <w:fldChar w:fldCharType="begin"/>
+    </w:r>
+    <w:r>
+      <w:instrText xml:space="preserve"> PAGE </w:instrText>
+    </w:r>
+    <w:r>
+      <w:fldChar w:fldCharType="end"/>
+    </w:r>
+  </w:p>
+</w:ftr>
+</file>
+
+<file path=word/footer13.xml><?xml version="1.0" encoding="utf-8"?>
+<w:ftr xmlns:m="http://schemas.openxmlformats.org/officeDocument/2006/math" xmlns:mc="http://schemas.openxmlformats.org/markup-compatibility/2006" xmlns:mo="http://schemas.microsoft.com/office/mac/office/2008/main" xmlns:mv="urn:schemas-microsoft-com:mac:vml" xmlns:o="urn:schemas-microsoft-com:office:office" xmlns:r="http://schemas.openxmlformats.org/officeDocument/2006/relationships" xmlns:v="urn:schemas-microsoft-com:vml" xmlns:w10="urn:schemas-microsoft-com:office:word" xmlns:w14="http://schemas.microsoft.com/office/word/2010/wordml" xmlns:w="http://schemas.openxmlformats.org/wordprocessingml/2006/main" xmlns:wne="http://schemas.microsoft.com/office/word/2006/wordml" xmlns:wp14="http://schemas.microsoft.com/office/word/2010/wordprocessingDrawing" xmlns:wp="http://schemas.openxmlformats.org/drawingml/2006/wordprocessingDrawing" xmlns:wpc="http://schemas.microsoft.com/office/word/2010/wordprocessingCanvas" xmlns:wpg="http://schemas.microsoft.com/office/word/2010/wordprocessingGroup" xmlns:wpi="http://schemas.microsoft.com/office/word/2010/wordprocessingInk" xmlns:wps="http://schemas.microsoft.com/office/word/2010/wordprocessingShape" mc:Ignorable="w14 wp14">
+  <w:p>
+    <w:pPr>
+      <w:pStyle w:val="Footer"/>
+      <w:jc w:val="center"/>
+    </w:pPr>
+    <w:r>
+      <w:fldChar w:fldCharType="begin"/>
+    </w:r>
+    <w:r>
+      <w:instrText xml:space="preserve"> PAGE </w:instrText>
+    </w:r>
+    <w:r>
+      <w:fldChar w:fldCharType="end"/>
+    </w:r>
+  </w:p>
+</w:ftr>
+</file>
+
+<file path=word/footer14.xml><?xml version="1.0" encoding="utf-8"?>
+<w:ftr xmlns:m="http://schemas.openxmlformats.org/officeDocument/2006/math" xmlns:mc="http://schemas.openxmlformats.org/markup-compatibility/2006" xmlns:mo="http://schemas.microsoft.com/office/mac/office/2008/main" xmlns:mv="urn:schemas-microsoft-com:mac:vml" xmlns:o="urn:schemas-microsoft-com:office:office" xmlns:r="http://schemas.openxmlformats.org/officeDocument/2006/relationships" xmlns:v="urn:schemas-microsoft-com:vml" xmlns:w10="urn:schemas-microsoft-com:office:word" xmlns:w14="http://schemas.microsoft.com/office/word/2010/wordml" xmlns:w="http://schemas.openxmlformats.org/wordprocessingml/2006/main" xmlns:wne="http://schemas.microsoft.com/office/word/2006/wordml" xmlns:wp14="http://schemas.microsoft.com/office/word/2010/wordprocessingDrawing" xmlns:wp="http://schemas.openxmlformats.org/drawingml/2006/wordprocessingDrawing" xmlns:wpc="http://schemas.microsoft.com/office/word/2010/wordprocessingCanvas" xmlns:wpg="http://schemas.microsoft.com/office/word/2010/wordprocessingGroup" xmlns:wpi="http://schemas.microsoft.com/office/word/2010/wordprocessingInk" xmlns:wps="http://schemas.microsoft.com/office/word/2010/wordprocessingShape" mc:Ignorable="w14 wp14">
+  <w:p>
+    <w:pPr>
+      <w:pStyle w:val="Footer"/>
+      <w:jc w:val="center"/>
+      <w:pBdr>
+        <w:top w:val="single" w:sz="6" w:space="1" w:color="000000"/>
+      </w:pBdr>
+    </w:pPr>
+    <w:r>
+      <w:fldChar w:fldCharType="begin"/>
+    </w:r>
+    <w:r>
+      <w:instrText xml:space="preserve"> PAGE </w:instrText>
+    </w:r>
+    <w:r>
+      <w:fldChar w:fldCharType="end"/>
+    </w:r>
+  </w:p>
+</w:ftr>
+</file>
+
+<file path=word/footer15.xml><?xml version="1.0" encoding="utf-8"?>
+<w:ftr xmlns:m="http://schemas.openxmlformats.org/officeDocument/2006/math" xmlns:mc="http://schemas.openxmlformats.org/markup-compatibility/2006" xmlns:mo="http://schemas.microsoft.com/office/mac/office/2008/main" xmlns:mv="urn:schemas-microsoft-com:mac:vml" xmlns:o="urn:schemas-microsoft-com:office:office" xmlns:r="http://schemas.openxmlformats.org/officeDocument/2006/relationships" xmlns:v="urn:schemas-microsoft-com:vml" xmlns:w10="urn:schemas-microsoft-com:office:word" xmlns:w14="http://schemas.microsoft.com/office/word/2010/wordml" xmlns:w="http://schemas.openxmlformats.org/wordprocessingml/2006/main" xmlns:wne="http://schemas.microsoft.com/office/word/2006/wordml" xmlns:wp14="http://schemas.microsoft.com/office/word/2010/wordprocessingDrawing" xmlns:wp="http://schemas.openxmlformats.org/drawingml/2006/wordprocessingDrawing" xmlns:wpc="http://schemas.microsoft.com/office/word/2010/wordprocessingCanvas" xmlns:wpg="http://schemas.microsoft.com/office/word/2010/wordprocessingGroup" xmlns:wpi="http://schemas.microsoft.com/office/word/2010/wordprocessingInk" xmlns:wps="http://schemas.microsoft.com/office/word/2010/wordprocessingShape" mc:Ignorable="w14 wp14">
+  <w:p>
+    <w:pPr>
+      <w:pStyle w:val="Footer"/>
+      <w:jc w:val="center"/>
+    </w:pPr>
+    <w:r>
+      <w:fldChar w:fldCharType="begin"/>
+    </w:r>
+    <w:r>
+      <w:instrText xml:space="preserve"> PAGE </w:instrText>
+    </w:r>
+    <w:r>
+      <w:fldChar w:fldCharType="end"/>
+    </w:r>
+  </w:p>
+</w:ftr>
+</file>
+
+<file path=word/footer16.xml><?xml version="1.0" encoding="utf-8"?>
+<w:ftr xmlns:m="http://schemas.openxmlformats.org/officeDocument/2006/math" xmlns:mc="http://schemas.openxmlformats.org/markup-compatibility/2006" xmlns:mo="http://schemas.microsoft.com/office/mac/office/2008/main" xmlns:mv="urn:schemas-microsoft-com:mac:vml" xmlns:o="urn:schemas-microsoft-com:office:office" xmlns:r="http://schemas.openxmlformats.org/officeDocument/2006/relationships" xmlns:v="urn:schemas-microsoft-com:vml" xmlns:w10="urn:schemas-microsoft-com:office:word" xmlns:w14="http://schemas.microsoft.com/office/word/2010/wordml" xmlns:w="http://schemas.openxmlformats.org/wordprocessingml/2006/main" xmlns:wne="http://schemas.microsoft.com/office/word/2006/wordml" xmlns:wp14="http://schemas.microsoft.com/office/word/2010/wordprocessingDrawing" xmlns:wp="http://schemas.openxmlformats.org/drawingml/2006/wordprocessingDrawing" xmlns:wpc="http://schemas.microsoft.com/office/word/2010/wordprocessingCanvas" xmlns:wpg="http://schemas.microsoft.com/office/word/2010/wordprocessingGroup" xmlns:wpi="http://schemas.microsoft.com/office/word/2010/wordprocessingInk" xmlns:wps="http://schemas.microsoft.com/office/word/2010/wordprocessingShape" mc:Ignorable="w14 wp14">
+  <w:p>
+    <w:pPr>
+      <w:pStyle w:val="Footer"/>
+      <w:jc w:val="center"/>
+      <w:pBdr>
+        <w:top w:val="single" w:sz="6" w:space="1" w:color="000000"/>
+      </w:pBdr>
+    </w:pPr>
+    <w:r>
+      <w:fldChar w:fldCharType="begin"/>
+    </w:r>
+    <w:r>
+      <w:instrText xml:space="preserve"> PAGE </w:instrText>
+    </w:r>
+    <w:r>
+      <w:fldChar w:fldCharType="end"/>
+    </w:r>
+  </w:p>
+</w:ftr>
+</file>
+
+<file path=word/footer17.xml><?xml version="1.0" encoding="utf-8"?>
+<w:ftr xmlns:m="http://schemas.openxmlformats.org/officeDocument/2006/math" xmlns:mc="http://schemas.openxmlformats.org/markup-compatibility/2006" xmlns:mo="http://schemas.microsoft.com/office/mac/office/2008/main" xmlns:mv="urn:schemas-microsoft-com:mac:vml" xmlns:o="urn:schemas-microsoft-com:office:office" xmlns:r="http://schemas.openxmlformats.org/officeDocument/2006/relationships" xmlns:v="urn:schemas-microsoft-com:vml" xmlns:w10="urn:schemas-microsoft-com:office:word" xmlns:w14="http://schemas.microsoft.com/office/word/2010/wordml" xmlns:w="http://schemas.openxmlformats.org/wordprocessingml/2006/main" xmlns:wne="http://schemas.microsoft.com/office/word/2006/wordml" xmlns:wp14="http://schemas.microsoft.com/office/word/2010/wordprocessingDrawing" xmlns:wp="http://schemas.openxmlformats.org/drawingml/2006/wordprocessingDrawing" xmlns:wpc="http://schemas.microsoft.com/office/word/2010/wordprocessingCanvas" xmlns:wpg="http://schemas.microsoft.com/office/word/2010/wordprocessingGroup" xmlns:wpi="http://schemas.microsoft.com/office/word/2010/wordprocessingInk" xmlns:wps="http://schemas.microsoft.com/office/word/2010/wordprocessingShape" mc:Ignorable="w14 wp14">
+  <w:p>
+    <w:pPr>
+      <w:pStyle w:val="Footer"/>
+      <w:jc w:val="center"/>
+    </w:pPr>
+    <w:r>
+      <w:fldChar w:fldCharType="begin"/>
+    </w:r>
+    <w:r>
+      <w:instrText xml:space="preserve"> PAGE </w:instrText>
+    </w:r>
+    <w:r>
+      <w:fldChar w:fldCharType="end"/>
+    </w:r>
+  </w:p>
+</w:ftr>
+</file>
+
 <file path=word/footer2.xml><?xml version="1.0" encoding="utf-8"?>
 <w:ftr xmlns:m="http://schemas.openxmlformats.org/officeDocument/2006/math" xmlns:mc="http://schemas.openxmlformats.org/markup-compatibility/2006" xmlns:mo="http://schemas.microsoft.com/office/mac/office/2008/main" xmlns:mv="urn:schemas-microsoft-com:mac:vml" xmlns:o="urn:schemas-microsoft-com:office:office" xmlns:r="http://schemas.openxmlformats.org/officeDocument/2006/relationships" xmlns:v="urn:schemas-microsoft-com:vml" xmlns:w10="urn:schemas-microsoft-com:office:word" xmlns:w14="http://schemas.microsoft.com/office/word/2010/wordml" xmlns:w="http://schemas.openxmlformats.org/wordprocessingml/2006/main" xmlns:wne="http://schemas.microsoft.com/office/word/2006/wordml" xmlns:wp14="http://schemas.microsoft.com/office/word/2010/wordprocessingDrawing" xmlns:wp="http://schemas.openxmlformats.org/drawingml/2006/wordprocessingDrawing" xmlns:wpc="http://schemas.microsoft.com/office/word/2010/wordprocessingCanvas" xmlns:wpg="http://schemas.microsoft.com/office/word/2010/wordprocessingGroup" xmlns:wpi="http://schemas.microsoft.com/office/word/2010/wordprocessingInk" xmlns:wps="http://schemas.microsoft.com/office/word/2010/wordprocessingShape" mc:Ignorable="w14 wp14">
   <w:p>
@@ -22187,6 +22319,122 @@
       </w:rPr>
       <w:t>Chapter 1.  INTRODUCTION</w:t>
     </w:r>
+  </w:p>
+</w:hdr>
+</file>
+
+<file path=word/header10.xml><?xml version="1.0" encoding="utf-8"?>
+<w:hdr xmlns:m="http://schemas.openxmlformats.org/officeDocument/2006/math" xmlns:mc="http://schemas.openxmlformats.org/markup-compatibility/2006" xmlns:mo="http://schemas.microsoft.com/office/mac/office/2008/main" xmlns:mv="urn:schemas-microsoft-com:mac:vml" xmlns:o="urn:schemas-microsoft-com:office:office" xmlns:r="http://schemas.openxmlformats.org/officeDocument/2006/relationships" xmlns:v="urn:schemas-microsoft-com:vml" xmlns:w10="urn:schemas-microsoft-com:office:word" xmlns:w14="http://schemas.microsoft.com/office/word/2010/wordml" xmlns:w="http://schemas.openxmlformats.org/wordprocessingml/2006/main" xmlns:wne="http://schemas.microsoft.com/office/word/2006/wordml" xmlns:wp14="http://schemas.microsoft.com/office/word/2010/wordprocessingDrawing" xmlns:wp="http://schemas.openxmlformats.org/drawingml/2006/wordprocessingDrawing" xmlns:wpc="http://schemas.microsoft.com/office/word/2010/wordprocessingCanvas" xmlns:wpg="http://schemas.microsoft.com/office/word/2010/wordprocessingGroup" xmlns:wpi="http://schemas.microsoft.com/office/word/2010/wordprocessingInk" xmlns:wps="http://schemas.microsoft.com/office/word/2010/wordprocessingShape" mc:Ignorable="w14 wp14">
+  <w:p>
+    <w:pPr>
+      <w:pStyle w:val="Header"/>
+    </w:pPr>
+  </w:p>
+</w:hdr>
+</file>
+
+<file path=word/header11.xml><?xml version="1.0" encoding="utf-8"?>
+<w:hdr xmlns:m="http://schemas.openxmlformats.org/officeDocument/2006/math" xmlns:mc="http://schemas.openxmlformats.org/markup-compatibility/2006" xmlns:mo="http://schemas.microsoft.com/office/mac/office/2008/main" xmlns:mv="urn:schemas-microsoft-com:mac:vml" xmlns:o="urn:schemas-microsoft-com:office:office" xmlns:r="http://schemas.openxmlformats.org/officeDocument/2006/relationships" xmlns:v="urn:schemas-microsoft-com:vml" xmlns:w10="urn:schemas-microsoft-com:office:word" xmlns:w14="http://schemas.microsoft.com/office/word/2010/wordml" xmlns:w="http://schemas.openxmlformats.org/wordprocessingml/2006/main" xmlns:wne="http://schemas.microsoft.com/office/word/2006/wordml" xmlns:wp14="http://schemas.microsoft.com/office/word/2010/wordprocessingDrawing" xmlns:wp="http://schemas.openxmlformats.org/drawingml/2006/wordprocessingDrawing" xmlns:wpc="http://schemas.microsoft.com/office/word/2010/wordprocessingCanvas" xmlns:wpg="http://schemas.microsoft.com/office/word/2010/wordprocessingGroup" xmlns:wpi="http://schemas.microsoft.com/office/word/2010/wordprocessingInk" xmlns:wps="http://schemas.microsoft.com/office/word/2010/wordprocessingShape" mc:Ignorable="w14 wp14">
+  <w:p>
+    <w:pPr>
+      <w:pStyle w:val="Header"/>
+    </w:pPr>
+  </w:p>
+</w:hdr>
+</file>
+
+<file path=word/header12.xml><?xml version="1.0" encoding="utf-8"?>
+<w:hdr xmlns:m="http://schemas.openxmlformats.org/officeDocument/2006/math" xmlns:mc="http://schemas.openxmlformats.org/markup-compatibility/2006" xmlns:mo="http://schemas.microsoft.com/office/mac/office/2008/main" xmlns:mv="urn:schemas-microsoft-com:mac:vml" xmlns:o="urn:schemas-microsoft-com:office:office" xmlns:r="http://schemas.openxmlformats.org/officeDocument/2006/relationships" xmlns:v="urn:schemas-microsoft-com:vml" xmlns:w10="urn:schemas-microsoft-com:office:word" xmlns:w14="http://schemas.microsoft.com/office/word/2010/wordml" xmlns:w="http://schemas.openxmlformats.org/wordprocessingml/2006/main" xmlns:wne="http://schemas.microsoft.com/office/word/2006/wordml" xmlns:wp14="http://schemas.microsoft.com/office/word/2010/wordprocessingDrawing" xmlns:wp="http://schemas.openxmlformats.org/drawingml/2006/wordprocessingDrawing" xmlns:wpc="http://schemas.microsoft.com/office/word/2010/wordprocessingCanvas" xmlns:wpg="http://schemas.microsoft.com/office/word/2010/wordprocessingGroup" xmlns:wpi="http://schemas.microsoft.com/office/word/2010/wordprocessingInk" xmlns:wps="http://schemas.microsoft.com/office/word/2010/wordprocessingShape" mc:Ignorable="w14 wp14">
+  <w:p>
+    <w:pPr>
+      <w:pStyle w:val="Header"/>
+      <w:jc w:val="left"/>
+      <w:pBdr>
+        <w:bottom w:val="single" w:sz="6" w:space="1" w:color="000000"/>
+      </w:pBdr>
+      <w:spacing w:after="120"/>
+    </w:pPr>
+    <w:r>
+      <w:rPr>
+        <w:rFonts w:ascii="Times New Roman" w:hAnsi="Times New Roman"/>
+        <w:sz w:val="24"/>
+      </w:rPr>
+      <w:t>Table of Contents</w:t>
+    </w:r>
+  </w:p>
+</w:hdr>
+</file>
+
+<file path=word/header13.xml><?xml version="1.0" encoding="utf-8"?>
+<w:hdr xmlns:m="http://schemas.openxmlformats.org/officeDocument/2006/math" xmlns:mc="http://schemas.openxmlformats.org/markup-compatibility/2006" xmlns:mo="http://schemas.microsoft.com/office/mac/office/2008/main" xmlns:mv="urn:schemas-microsoft-com:mac:vml" xmlns:o="urn:schemas-microsoft-com:office:office" xmlns:r="http://schemas.openxmlformats.org/officeDocument/2006/relationships" xmlns:v="urn:schemas-microsoft-com:vml" xmlns:w10="urn:schemas-microsoft-com:office:word" xmlns:w14="http://schemas.microsoft.com/office/word/2010/wordml" xmlns:w="http://schemas.openxmlformats.org/wordprocessingml/2006/main" xmlns:wne="http://schemas.microsoft.com/office/word/2006/wordml" xmlns:wp14="http://schemas.microsoft.com/office/word/2010/wordprocessingDrawing" xmlns:wp="http://schemas.openxmlformats.org/drawingml/2006/wordprocessingDrawing" xmlns:wpc="http://schemas.microsoft.com/office/word/2010/wordprocessingCanvas" xmlns:wpg="http://schemas.microsoft.com/office/word/2010/wordprocessingGroup" xmlns:wpi="http://schemas.microsoft.com/office/word/2010/wordprocessingInk" xmlns:wps="http://schemas.microsoft.com/office/word/2010/wordprocessingShape" mc:Ignorable="w14 wp14">
+  <w:p>
+    <w:pPr>
+      <w:pStyle w:val="Header"/>
+    </w:pPr>
+  </w:p>
+</w:hdr>
+</file>
+
+<file path=word/header14.xml><?xml version="1.0" encoding="utf-8"?>
+<w:hdr xmlns:m="http://schemas.openxmlformats.org/officeDocument/2006/math" xmlns:mc="http://schemas.openxmlformats.org/markup-compatibility/2006" xmlns:mo="http://schemas.microsoft.com/office/mac/office/2008/main" xmlns:mv="urn:schemas-microsoft-com:mac:vml" xmlns:o="urn:schemas-microsoft-com:office:office" xmlns:r="http://schemas.openxmlformats.org/officeDocument/2006/relationships" xmlns:v="urn:schemas-microsoft-com:vml" xmlns:w10="urn:schemas-microsoft-com:office:word" xmlns:w14="http://schemas.microsoft.com/office/word/2010/wordml" xmlns:w="http://schemas.openxmlformats.org/wordprocessingml/2006/main" xmlns:wne="http://schemas.microsoft.com/office/word/2006/wordml" xmlns:wp14="http://schemas.microsoft.com/office/word/2010/wordprocessingDrawing" xmlns:wp="http://schemas.openxmlformats.org/drawingml/2006/wordprocessingDrawing" xmlns:wpc="http://schemas.microsoft.com/office/word/2010/wordprocessingCanvas" xmlns:wpg="http://schemas.microsoft.com/office/word/2010/wordprocessingGroup" xmlns:wpi="http://schemas.microsoft.com/office/word/2010/wordprocessingInk" xmlns:wps="http://schemas.microsoft.com/office/word/2010/wordprocessingShape" mc:Ignorable="w14 wp14">
+  <w:p>
+    <w:pPr>
+      <w:pStyle w:val="Header"/>
+      <w:jc w:val="left"/>
+      <w:pBdr>
+        <w:bottom w:val="single" w:sz="6" w:space="1" w:color="000000"/>
+      </w:pBdr>
+      <w:spacing w:after="120"/>
+    </w:pPr>
+    <w:r>
+      <w:rPr>
+        <w:rFonts w:ascii="Times New Roman" w:hAnsi="Times New Roman"/>
+        <w:sz w:val="24"/>
+      </w:rPr>
+      <w:t>List of Figures</w:t>
+    </w:r>
+  </w:p>
+</w:hdr>
+</file>
+
+<file path=word/header15.xml><?xml version="1.0" encoding="utf-8"?>
+<w:hdr xmlns:m="http://schemas.openxmlformats.org/officeDocument/2006/math" xmlns:mc="http://schemas.openxmlformats.org/markup-compatibility/2006" xmlns:mo="http://schemas.microsoft.com/office/mac/office/2008/main" xmlns:mv="urn:schemas-microsoft-com:mac:vml" xmlns:o="urn:schemas-microsoft-com:office:office" xmlns:r="http://schemas.openxmlformats.org/officeDocument/2006/relationships" xmlns:v="urn:schemas-microsoft-com:vml" xmlns:w10="urn:schemas-microsoft-com:office:word" xmlns:w14="http://schemas.microsoft.com/office/word/2010/wordml" xmlns:w="http://schemas.openxmlformats.org/wordprocessingml/2006/main" xmlns:wne="http://schemas.microsoft.com/office/word/2006/wordml" xmlns:wp14="http://schemas.microsoft.com/office/word/2010/wordprocessingDrawing" xmlns:wp="http://schemas.openxmlformats.org/drawingml/2006/wordprocessingDrawing" xmlns:wpc="http://schemas.microsoft.com/office/word/2010/wordprocessingCanvas" xmlns:wpg="http://schemas.microsoft.com/office/word/2010/wordprocessingGroup" xmlns:wpi="http://schemas.microsoft.com/office/word/2010/wordprocessingInk" xmlns:wps="http://schemas.microsoft.com/office/word/2010/wordprocessingShape" mc:Ignorable="w14 wp14">
+  <w:p>
+    <w:pPr>
+      <w:pStyle w:val="Header"/>
+    </w:pPr>
+  </w:p>
+</w:hdr>
+</file>
+
+<file path=word/header16.xml><?xml version="1.0" encoding="utf-8"?>
+<w:hdr xmlns:m="http://schemas.openxmlformats.org/officeDocument/2006/math" xmlns:mc="http://schemas.openxmlformats.org/markup-compatibility/2006" xmlns:mo="http://schemas.microsoft.com/office/mac/office/2008/main" xmlns:mv="urn:schemas-microsoft-com:mac:vml" xmlns:o="urn:schemas-microsoft-com:office:office" xmlns:r="http://schemas.openxmlformats.org/officeDocument/2006/relationships" xmlns:v="urn:schemas-microsoft-com:vml" xmlns:w10="urn:schemas-microsoft-com:office:word" xmlns:w14="http://schemas.microsoft.com/office/word/2010/wordml" xmlns:w="http://schemas.openxmlformats.org/wordprocessingml/2006/main" xmlns:wne="http://schemas.microsoft.com/office/word/2006/wordml" xmlns:wp14="http://schemas.microsoft.com/office/word/2010/wordprocessingDrawing" xmlns:wp="http://schemas.openxmlformats.org/drawingml/2006/wordprocessingDrawing" xmlns:wpc="http://schemas.microsoft.com/office/word/2010/wordprocessingCanvas" xmlns:wpg="http://schemas.microsoft.com/office/word/2010/wordprocessingGroup" xmlns:wpi="http://schemas.microsoft.com/office/word/2010/wordprocessingInk" xmlns:wps="http://schemas.microsoft.com/office/word/2010/wordprocessingShape" mc:Ignorable="w14 wp14">
+  <w:p>
+    <w:pPr>
+      <w:pStyle w:val="Header"/>
+      <w:jc w:val="left"/>
+      <w:pBdr>
+        <w:bottom w:val="single" w:sz="6" w:space="1" w:color="000000"/>
+      </w:pBdr>
+      <w:spacing w:after="120"/>
+    </w:pPr>
+    <w:r>
+      <w:rPr>
+        <w:rFonts w:ascii="Times New Roman" w:hAnsi="Times New Roman"/>
+        <w:sz w:val="24"/>
+      </w:rPr>
+      <w:t>List of Tables</w:t>
+    </w:r>
+  </w:p>
+</w:hdr>
+</file>
+
+<file path=word/header17.xml><?xml version="1.0" encoding="utf-8"?>
+<w:hdr xmlns:m="http://schemas.openxmlformats.org/officeDocument/2006/math" xmlns:mc="http://schemas.openxmlformats.org/markup-compatibility/2006" xmlns:mo="http://schemas.microsoft.com/office/mac/office/2008/main" xmlns:mv="urn:schemas-microsoft-com:mac:vml" xmlns:o="urn:schemas-microsoft-com:office:office" xmlns:r="http://schemas.openxmlformats.org/officeDocument/2006/relationships" xmlns:v="urn:schemas-microsoft-com:vml" xmlns:w10="urn:schemas-microsoft-com:office:word" xmlns:w14="http://schemas.microsoft.com/office/word/2010/wordml" xmlns:w="http://schemas.openxmlformats.org/wordprocessingml/2006/main" xmlns:wne="http://schemas.microsoft.com/office/word/2006/wordml" xmlns:wp14="http://schemas.microsoft.com/office/word/2010/wordprocessingDrawing" xmlns:wp="http://schemas.openxmlformats.org/drawingml/2006/wordprocessingDrawing" xmlns:wpc="http://schemas.microsoft.com/office/word/2010/wordprocessingCanvas" xmlns:wpg="http://schemas.microsoft.com/office/word/2010/wordprocessingGroup" xmlns:wpi="http://schemas.microsoft.com/office/word/2010/wordprocessingInk" xmlns:wps="http://schemas.microsoft.com/office/word/2010/wordprocessingShape" mc:Ignorable="w14 wp14">
+  <w:p>
+    <w:pPr>
+      <w:pStyle w:val="Header"/>
+    </w:pPr>
   </w:p>
 </w:hdr>
 </file>

</xml_diff>